<commit_message>
Add Meeting of Minutes No.5
</commit_message>
<xml_diff>
--- a/Document/Meeting Minutes v2.docx
+++ b/Document/Meeting Minutes v2.docx
@@ -5105,15 +5105,7 @@
           <w:b/>
           <w:highlight w:val="none"/>
         </w:rPr>
-        <w:t xml:space="preserve">  No</w:t>
-      </w:r>
-      <w:r>
-        <w:rPr>
-          <w:rFonts w:hint="default" w:ascii="Times New Roman" w:hAnsi="Times New Roman" w:eastAsia="Times New Roman" w:cs="Times New Roman"/>
-          <w:b/>
-          <w:highlight w:val="none"/>
-        </w:rPr>
-        <w:t xml:space="preserve">   </w:t>
+        <w:t xml:space="preserve">  No   </w:t>
       </w:r>
     </w:p>
     <w:p>
@@ -5998,17 +5990,7 @@
           <w:sz w:val="24"/>
           <w:szCs w:val="24"/>
         </w:rPr>
-        <w:t xml:space="preserve"> The Leader will fin</w:t>
-      </w:r>
-      <w:bookmarkStart w:id="1" w:name="_GoBack"/>
-      <w:bookmarkEnd w:id="1"/>
-      <w:r>
-        <w:rPr>
-          <w:rFonts w:hint="default" w:ascii="Times New Roman" w:hAnsi="Times New Roman" w:eastAsia="SimSun" w:cs="Times New Roman"/>
-          <w:sz w:val="24"/>
-          <w:szCs w:val="24"/>
-        </w:rPr>
-        <w:t>alize the suggested models and datasets by the end of the break.</w:t>
+        <w:t xml:space="preserve"> The Leader will finalize the suggested models and datasets by the end of the break.</w:t>
       </w:r>
     </w:p>
     <w:p>
@@ -6127,7 +6109,7 @@
           <w:bCs/>
           <w:lang w:val="en-US"/>
         </w:rPr>
-        <w:t>11</w:t>
+        <w:t>4</w:t>
       </w:r>
       <w:r>
         <w:rPr>
@@ -6146,8 +6128,2056 @@
           <w:bCs/>
           <w:lang w:val="en-US"/>
         </w:rPr>
-        <w:t xml:space="preserve"> Feb, 2026 - Google Meet</w:t>
-      </w:r>
+        <w:t xml:space="preserve"> Mar, 2026 - Google Meet</w:t>
+      </w:r>
+    </w:p>
+    <w:p>
+      <w:pPr>
+        <w:jc w:val="both"/>
+        <w:rPr>
+          <w:rFonts w:hint="default" w:ascii="Times New Roman" w:hAnsi="Times New Roman" w:eastAsia="Times New Roman" w:cs="Times New Roman"/>
+          <w:b w:val="0"/>
+          <w:bCs/>
+          <w:lang w:val="en-US"/>
+        </w:rPr>
+      </w:pPr>
+    </w:p>
+    <w:p>
+      <w:pPr>
+        <w:jc w:val="center"/>
+        <w:rPr>
+          <w:rFonts w:hint="default" w:ascii="Times New Roman" w:hAnsi="Times New Roman" w:cs="Times New Roman"/>
+          <w:b/>
+          <w:sz w:val="32"/>
+          <w:szCs w:val="32"/>
+          <w:lang w:val="en-US"/>
+        </w:rPr>
+      </w:pPr>
+      <w:r>
+        <w:rPr>
+          <w:rFonts w:hint="default" w:ascii="Times New Roman" w:hAnsi="Times New Roman" w:cs="Times New Roman"/>
+          <w:b/>
+          <w:sz w:val="32"/>
+          <w:szCs w:val="32"/>
+        </w:rPr>
+        <w:t>Meeting Minutes</w:t>
+      </w:r>
+      <w:r>
+        <w:rPr>
+          <w:rFonts w:hint="default" w:ascii="Times New Roman" w:hAnsi="Times New Roman" w:cs="Times New Roman"/>
+          <w:b/>
+          <w:sz w:val="32"/>
+          <w:szCs w:val="32"/>
+          <w:lang w:val="en-US"/>
+        </w:rPr>
+        <w:t xml:space="preserve"> No.5</w:t>
+      </w:r>
+    </w:p>
+    <w:p>
+      <w:pPr>
+        <w:jc w:val="both"/>
+        <w:rPr>
+          <w:rFonts w:hint="default" w:ascii="Times New Roman" w:hAnsi="Times New Roman" w:eastAsia="Times New Roman" w:cs="Times New Roman"/>
+          <w:lang w:val="en-US"/>
+        </w:rPr>
+      </w:pPr>
+      <w:r>
+        <w:rPr>
+          <w:rFonts w:hint="default" w:ascii="Times New Roman" w:hAnsi="Times New Roman" w:eastAsia="Times New Roman" w:cs="Times New Roman"/>
+          <w:b/>
+        </w:rPr>
+        <w:t>Team name</w:t>
+      </w:r>
+      <w:r>
+        <w:rPr>
+          <w:rFonts w:hint="default" w:ascii="Times New Roman" w:hAnsi="Times New Roman" w:eastAsia="Times New Roman" w:cs="Times New Roman"/>
+        </w:rPr>
+        <w:t>:</w:t>
+      </w:r>
+      <w:r>
+        <w:rPr>
+          <w:rFonts w:hint="default" w:ascii="Times New Roman" w:hAnsi="Times New Roman" w:eastAsia="Times New Roman" w:cs="Times New Roman"/>
+          <w:lang w:val="en-US"/>
+        </w:rPr>
+        <w:t xml:space="preserve"> Lowkenuinely</w:t>
+      </w:r>
+    </w:p>
+    <w:p>
+      <w:pPr>
+        <w:jc w:val="both"/>
+        <w:rPr>
+          <w:rFonts w:hint="default" w:ascii="Times New Roman" w:hAnsi="Times New Roman" w:eastAsia="Times New Roman" w:cs="Times New Roman"/>
+        </w:rPr>
+      </w:pPr>
+    </w:p>
+    <w:p>
+      <w:pPr>
+        <w:jc w:val="both"/>
+        <w:rPr>
+          <w:rFonts w:hint="default" w:ascii="Times New Roman" w:hAnsi="Times New Roman" w:eastAsia="Times New Roman" w:cs="Times New Roman"/>
+          <w:lang w:val="en-US"/>
+        </w:rPr>
+      </w:pPr>
+      <w:r>
+        <w:rPr>
+          <w:rFonts w:hint="default" w:ascii="Times New Roman" w:hAnsi="Times New Roman" w:eastAsia="Times New Roman" w:cs="Times New Roman"/>
+          <w:b/>
+        </w:rPr>
+        <w:t>Meeting No</w:t>
+      </w:r>
+      <w:r>
+        <w:rPr>
+          <w:rFonts w:hint="default" w:ascii="Times New Roman" w:hAnsi="Times New Roman" w:eastAsia="Times New Roman" w:cs="Times New Roman"/>
+        </w:rPr>
+        <w:t xml:space="preserve">: </w:t>
+      </w:r>
+      <w:r>
+        <w:rPr>
+          <w:rFonts w:hint="default" w:ascii="Times New Roman" w:hAnsi="Times New Roman" w:eastAsia="Times New Roman" w:cs="Times New Roman"/>
+          <w:lang w:val="en-US"/>
+        </w:rPr>
+        <w:t>5</w:t>
+      </w:r>
+    </w:p>
+    <w:p>
+      <w:pPr>
+        <w:jc w:val="both"/>
+        <w:rPr>
+          <w:rFonts w:hint="default" w:ascii="Times New Roman" w:hAnsi="Times New Roman" w:eastAsia="Times New Roman" w:cs="Times New Roman"/>
+          <w:lang w:val="en-US"/>
+        </w:rPr>
+      </w:pPr>
+      <w:r>
+        <w:rPr>
+          <w:rFonts w:hint="default" w:ascii="Times New Roman" w:hAnsi="Times New Roman" w:eastAsia="Times New Roman" w:cs="Times New Roman"/>
+          <w:b/>
+        </w:rPr>
+        <w:t>Location:</w:t>
+      </w:r>
+      <w:r>
+        <w:rPr>
+          <w:rFonts w:hint="default" w:ascii="Times New Roman" w:hAnsi="Times New Roman" w:eastAsia="Times New Roman" w:cs="Times New Roman"/>
+        </w:rPr>
+        <w:t xml:space="preserve"> </w:t>
+      </w:r>
+      <w:r>
+        <w:rPr>
+          <w:rFonts w:hint="default" w:ascii="Times New Roman" w:hAnsi="Times New Roman" w:eastAsia="Times New Roman" w:cs="Times New Roman"/>
+          <w:lang w:val="en-US"/>
+        </w:rPr>
+        <w:t>Online (Google Meet)</w:t>
+      </w:r>
+    </w:p>
+    <w:p>
+      <w:pPr>
+        <w:jc w:val="both"/>
+        <w:rPr>
+          <w:rFonts w:hint="default" w:ascii="Times New Roman" w:hAnsi="Times New Roman" w:eastAsia="Times New Roman" w:cs="Times New Roman"/>
+          <w:lang w:val="en-US"/>
+        </w:rPr>
+      </w:pPr>
+      <w:r>
+        <w:rPr>
+          <w:rFonts w:hint="default" w:ascii="Times New Roman" w:hAnsi="Times New Roman" w:eastAsia="Times New Roman" w:cs="Times New Roman"/>
+          <w:b/>
+        </w:rPr>
+        <w:t>Attending:</w:t>
+      </w:r>
+      <w:r>
+        <w:rPr>
+          <w:rFonts w:hint="default" w:ascii="Times New Roman" w:hAnsi="Times New Roman" w:eastAsia="Times New Roman" w:cs="Times New Roman"/>
+        </w:rPr>
+        <w:t xml:space="preserve"> </w:t>
+      </w:r>
+      <w:r>
+        <w:rPr>
+          <w:rFonts w:hint="default" w:ascii="Times New Roman" w:hAnsi="Times New Roman" w:eastAsia="Times New Roman" w:cs="Times New Roman"/>
+          <w:lang w:val="en-US"/>
+        </w:rPr>
+        <w:t xml:space="preserve">Truong Ngoc Gia Hieu, Duong Nguyen Dang, Pham Dinh Duc Anh, </w:t>
+      </w:r>
+      <w:r>
+        <w:rPr>
+          <w:rFonts w:hint="default" w:ascii="Times New Roman" w:hAnsi="Times New Roman" w:cs="Times New Roman"/>
+          <w:i w:val="0"/>
+          <w:iCs w:val="0"/>
+          <w:color w:val="000000"/>
+          <w:sz w:val="24"/>
+          <w:szCs w:val="24"/>
+          <w:u w:val="none"/>
+          <w:vertAlign w:val="baseline"/>
+        </w:rPr>
+        <w:t>Pahan Pathirathna</w:t>
+      </w:r>
+    </w:p>
+    <w:p>
+      <w:pPr>
+        <w:jc w:val="both"/>
+        <w:rPr>
+          <w:rFonts w:hint="default" w:ascii="Times New Roman" w:hAnsi="Times New Roman" w:eastAsia="Times New Roman" w:cs="Times New Roman"/>
+          <w:b w:val="0"/>
+          <w:bCs/>
+          <w:lang w:val="en-US"/>
+        </w:rPr>
+      </w:pPr>
+      <w:r>
+        <w:rPr>
+          <w:rFonts w:hint="default" w:ascii="Times New Roman" w:hAnsi="Times New Roman" w:eastAsia="Times New Roman" w:cs="Times New Roman"/>
+          <w:b/>
+        </w:rPr>
+        <w:t>Apologies:</w:t>
+      </w:r>
+      <w:r>
+        <w:rPr>
+          <w:rFonts w:hint="default" w:ascii="Times New Roman" w:hAnsi="Times New Roman" w:eastAsia="Times New Roman" w:cs="Times New Roman"/>
+          <w:b/>
+          <w:lang w:val="en-US"/>
+        </w:rPr>
+        <w:t xml:space="preserve"> </w:t>
+      </w:r>
+      <w:r>
+        <w:rPr>
+          <w:rFonts w:hint="default" w:ascii="Times New Roman" w:hAnsi="Times New Roman" w:eastAsia="Times New Roman" w:cs="Times New Roman"/>
+          <w:b w:val="0"/>
+          <w:bCs/>
+          <w:lang w:val="en-US"/>
+        </w:rPr>
+        <w:t>None</w:t>
+      </w:r>
+    </w:p>
+    <w:p>
+      <w:pPr>
+        <w:jc w:val="both"/>
+        <w:rPr>
+          <w:rFonts w:hint="default" w:ascii="Times New Roman" w:hAnsi="Times New Roman" w:eastAsia="Times New Roman" w:cs="Times New Roman"/>
+          <w:b w:val="0"/>
+          <w:bCs/>
+          <w:lang w:val="en-US"/>
+        </w:rPr>
+      </w:pPr>
+      <w:r>
+        <w:rPr>
+          <w:rFonts w:hint="default" w:ascii="Times New Roman" w:hAnsi="Times New Roman" w:eastAsia="Times New Roman" w:cs="Times New Roman"/>
+          <w:b/>
+        </w:rPr>
+        <w:t xml:space="preserve">Meeting </w:t>
+      </w:r>
+      <w:r>
+        <w:rPr>
+          <w:rFonts w:hint="default" w:ascii="Times New Roman" w:hAnsi="Times New Roman" w:eastAsia="Times New Roman" w:cs="Times New Roman"/>
+          <w:b/>
+          <w:lang w:val="en-US"/>
+        </w:rPr>
+        <w:t>date</w:t>
+      </w:r>
+      <w:r>
+        <w:rPr>
+          <w:rFonts w:hint="default" w:ascii="Times New Roman" w:hAnsi="Times New Roman" w:eastAsia="Times New Roman" w:cs="Times New Roman"/>
+          <w:b/>
+        </w:rPr>
+        <w:t>:</w:t>
+      </w:r>
+      <w:r>
+        <w:rPr>
+          <w:rFonts w:hint="default" w:ascii="Times New Roman" w:hAnsi="Times New Roman" w:eastAsia="Times New Roman" w:cs="Times New Roman"/>
+          <w:b/>
+          <w:lang w:val="en-US"/>
+        </w:rPr>
+        <w:t xml:space="preserve"> </w:t>
+      </w:r>
+      <w:r>
+        <w:rPr>
+          <w:rFonts w:hint="default" w:ascii="Times New Roman" w:hAnsi="Times New Roman" w:eastAsia="Times New Roman" w:cs="Times New Roman"/>
+          <w:lang w:val="en-US"/>
+        </w:rPr>
+        <w:t>4</w:t>
+      </w:r>
+      <w:r>
+        <w:rPr>
+          <w:rFonts w:hint="default" w:ascii="Times New Roman" w:hAnsi="Times New Roman" w:eastAsia="Times New Roman" w:cs="Times New Roman"/>
+          <w:vertAlign w:val="superscript"/>
+          <w:lang w:val="en-US"/>
+        </w:rPr>
+        <w:t>th</w:t>
+      </w:r>
+      <w:r>
+        <w:rPr>
+          <w:rFonts w:hint="default" w:ascii="Times New Roman" w:hAnsi="Times New Roman" w:eastAsia="Times New Roman" w:cs="Times New Roman"/>
+          <w:lang w:val="en-US"/>
+        </w:rPr>
+        <w:t xml:space="preserve"> Mar, 2026</w:t>
+      </w:r>
+    </w:p>
+    <w:p>
+      <w:pPr>
+        <w:jc w:val="both"/>
+        <w:rPr>
+          <w:rFonts w:hint="default" w:ascii="Times New Roman" w:hAnsi="Times New Roman" w:eastAsia="Times New Roman" w:cs="Times New Roman"/>
+          <w:lang w:val="en-US"/>
+        </w:rPr>
+      </w:pPr>
+      <w:r>
+        <w:rPr>
+          <w:rFonts w:hint="default" w:ascii="Times New Roman" w:hAnsi="Times New Roman" w:eastAsia="Times New Roman" w:cs="Times New Roman"/>
+          <w:b/>
+        </w:rPr>
+        <w:t>Meeting start time:</w:t>
+      </w:r>
+      <w:r>
+        <w:rPr>
+          <w:rFonts w:hint="default" w:ascii="Times New Roman" w:hAnsi="Times New Roman" w:eastAsia="Times New Roman" w:cs="Times New Roman"/>
+        </w:rPr>
+        <w:t xml:space="preserve"> </w:t>
+      </w:r>
+      <w:r>
+        <w:rPr>
+          <w:rFonts w:hint="default" w:ascii="Times New Roman" w:hAnsi="Times New Roman" w:eastAsia="Times New Roman" w:cs="Times New Roman"/>
+          <w:lang w:val="en-US"/>
+        </w:rPr>
+        <w:t>19:45 p.m</w:t>
+      </w:r>
+    </w:p>
+    <w:p>
+      <w:pPr>
+        <w:jc w:val="both"/>
+        <w:rPr>
+          <w:rFonts w:hint="default" w:ascii="Times New Roman" w:hAnsi="Times New Roman" w:eastAsia="Times New Roman" w:cs="Times New Roman"/>
+          <w:b/>
+        </w:rPr>
+      </w:pPr>
+      <w:r>
+        <w:rPr>
+          <w:rFonts w:hint="default" w:ascii="Times New Roman" w:hAnsi="Times New Roman" w:eastAsia="Times New Roman" w:cs="Times New Roman"/>
+          <w:b/>
+        </w:rPr>
+        <w:t xml:space="preserve">Matters arising from Previous minutes:                                 </w:t>
+      </w:r>
+      <w:r>
+        <w:rPr>
+          <w:rFonts w:hint="default" w:ascii="Times New Roman" w:hAnsi="Times New Roman" w:eastAsia="Times New Roman" w:cs="Times New Roman"/>
+          <w:b/>
+          <w:highlight w:val="none"/>
+        </w:rPr>
+        <w:t xml:space="preserve">           </w:t>
+      </w:r>
+      <w:r>
+        <w:rPr>
+          <w:rFonts w:hint="default" w:ascii="Times New Roman" w:hAnsi="Times New Roman" w:eastAsia="Times New Roman" w:cs="Times New Roman"/>
+          <w:b/>
+          <w:highlight w:val="cyan"/>
+        </w:rPr>
+        <w:t>Yes</w:t>
+      </w:r>
+      <w:r>
+        <w:rPr>
+          <w:rFonts w:hint="default" w:ascii="Times New Roman" w:hAnsi="Times New Roman" w:eastAsia="Times New Roman" w:cs="Times New Roman"/>
+          <w:b/>
+          <w:highlight w:val="none"/>
+        </w:rPr>
+        <w:t xml:space="preserve">     </w:t>
+      </w:r>
+      <w:r>
+        <w:rPr>
+          <w:rFonts w:hint="default" w:ascii="Times New Roman" w:hAnsi="Times New Roman" w:eastAsia="Times New Roman" w:cs="Times New Roman"/>
+          <w:b/>
+        </w:rPr>
+        <w:t xml:space="preserve">                            </w:t>
+      </w:r>
+      <w:r>
+        <w:rPr>
+          <w:rFonts w:hint="default" w:ascii="Times New Roman" w:hAnsi="Times New Roman" w:eastAsia="Times New Roman" w:cs="Times New Roman"/>
+          <w:b/>
+          <w:highlight w:val="none"/>
+        </w:rPr>
+        <w:t xml:space="preserve">  No   </w:t>
+      </w:r>
+    </w:p>
+    <w:p>
+      <w:pPr>
+        <w:jc w:val="both"/>
+        <w:rPr>
+          <w:rFonts w:hint="default" w:ascii="Times New Roman" w:hAnsi="Times New Roman" w:eastAsia="Times New Roman" w:cs="Times New Roman"/>
+          <w:b/>
+        </w:rPr>
+      </w:pPr>
+    </w:p>
+    <w:tbl>
+      <w:tblPr>
+        <w:tblStyle w:val="12"/>
+        <w:tblW w:w="13950" w:type="dxa"/>
+        <w:tblInd w:w="0" w:type="dxa"/>
+        <w:tblBorders>
+          <w:top w:val="single" w:color="000000" w:sz="4" w:space="0"/>
+          <w:left w:val="single" w:color="000000" w:sz="4" w:space="0"/>
+          <w:bottom w:val="single" w:color="000000" w:sz="4" w:space="0"/>
+          <w:right w:val="single" w:color="000000" w:sz="4" w:space="0"/>
+          <w:insideH w:val="single" w:color="000000" w:sz="4" w:space="0"/>
+          <w:insideV w:val="single" w:color="000000" w:sz="4" w:space="0"/>
+        </w:tblBorders>
+        <w:tblLayout w:type="fixed"/>
+        <w:tblCellMar>
+          <w:top w:w="0" w:type="dxa"/>
+          <w:left w:w="108" w:type="dxa"/>
+          <w:bottom w:w="0" w:type="dxa"/>
+          <w:right w:w="108" w:type="dxa"/>
+        </w:tblCellMar>
+      </w:tblPr>
+      <w:tblGrid>
+        <w:gridCol w:w="4650"/>
+        <w:gridCol w:w="4650"/>
+        <w:gridCol w:w="4650"/>
+      </w:tblGrid>
+      <w:tr>
+        <w:tblPrEx>
+          <w:tblBorders>
+            <w:top w:val="single" w:color="000000" w:sz="4" w:space="0"/>
+            <w:left w:val="single" w:color="000000" w:sz="4" w:space="0"/>
+            <w:bottom w:val="single" w:color="000000" w:sz="4" w:space="0"/>
+            <w:right w:val="single" w:color="000000" w:sz="4" w:space="0"/>
+            <w:insideH w:val="single" w:color="000000" w:sz="4" w:space="0"/>
+            <w:insideV w:val="single" w:color="000000" w:sz="4" w:space="0"/>
+          </w:tblBorders>
+          <w:tblCellMar>
+            <w:top w:w="0" w:type="dxa"/>
+            <w:left w:w="108" w:type="dxa"/>
+            <w:bottom w:w="0" w:type="dxa"/>
+            <w:right w:w="108" w:type="dxa"/>
+          </w:tblCellMar>
+        </w:tblPrEx>
+        <w:tc>
+          <w:tcPr>
+            <w:tcW w:w="4650" w:type="dxa"/>
+          </w:tcPr>
+          <w:p>
+            <w:pPr>
+              <w:jc w:val="both"/>
+              <w:rPr>
+                <w:rFonts w:hint="default" w:ascii="Times New Roman" w:hAnsi="Times New Roman" w:eastAsia="Times New Roman" w:cs="Times New Roman"/>
+                <w:b/>
+              </w:rPr>
+            </w:pPr>
+            <w:r>
+              <w:rPr>
+                <w:rFonts w:hint="default" w:ascii="Times New Roman" w:hAnsi="Times New Roman" w:eastAsia="Times New Roman" w:cs="Times New Roman"/>
+                <w:b/>
+              </w:rPr>
+              <w:t>Issues raised from previous minute</w:t>
+            </w:r>
+          </w:p>
+        </w:tc>
+        <w:tc>
+          <w:tcPr>
+            <w:tcW w:w="4650" w:type="dxa"/>
+          </w:tcPr>
+          <w:p>
+            <w:pPr>
+              <w:jc w:val="both"/>
+              <w:rPr>
+                <w:rFonts w:hint="default" w:ascii="Times New Roman" w:hAnsi="Times New Roman" w:eastAsia="Times New Roman" w:cs="Times New Roman"/>
+                <w:b/>
+              </w:rPr>
+            </w:pPr>
+            <w:r>
+              <w:rPr>
+                <w:rFonts w:hint="default" w:ascii="Times New Roman" w:hAnsi="Times New Roman" w:eastAsia="Times New Roman" w:cs="Times New Roman"/>
+                <w:b/>
+              </w:rPr>
+              <w:t>Discussions</w:t>
+            </w:r>
+          </w:p>
+        </w:tc>
+        <w:tc>
+          <w:tcPr>
+            <w:tcW w:w="4650" w:type="dxa"/>
+          </w:tcPr>
+          <w:p>
+            <w:pPr>
+              <w:jc w:val="both"/>
+              <w:rPr>
+                <w:rFonts w:hint="default" w:ascii="Times New Roman" w:hAnsi="Times New Roman" w:eastAsia="Times New Roman" w:cs="Times New Roman"/>
+                <w:b/>
+              </w:rPr>
+            </w:pPr>
+            <w:r>
+              <w:rPr>
+                <w:rFonts w:hint="default" w:ascii="Times New Roman" w:hAnsi="Times New Roman" w:eastAsia="Times New Roman" w:cs="Times New Roman"/>
+                <w:b/>
+              </w:rPr>
+              <w:t>Outcome (Resolved?)</w:t>
+            </w:r>
+          </w:p>
+        </w:tc>
+      </w:tr>
+      <w:tr>
+        <w:tblPrEx>
+          <w:tblBorders>
+            <w:top w:val="single" w:color="000000" w:sz="4" w:space="0"/>
+            <w:left w:val="single" w:color="000000" w:sz="4" w:space="0"/>
+            <w:bottom w:val="single" w:color="000000" w:sz="4" w:space="0"/>
+            <w:right w:val="single" w:color="000000" w:sz="4" w:space="0"/>
+            <w:insideH w:val="single" w:color="000000" w:sz="4" w:space="0"/>
+            <w:insideV w:val="single" w:color="000000" w:sz="4" w:space="0"/>
+          </w:tblBorders>
+          <w:tblCellMar>
+            <w:top w:w="0" w:type="dxa"/>
+            <w:left w:w="108" w:type="dxa"/>
+            <w:bottom w:w="0" w:type="dxa"/>
+            <w:right w:w="108" w:type="dxa"/>
+          </w:tblCellMar>
+        </w:tblPrEx>
+        <w:trPr>
+          <w:trHeight w:val="254" w:hRule="atLeast"/>
+        </w:trPr>
+        <w:tc>
+          <w:tcPr>
+            <w:tcW w:w="4650" w:type="dxa"/>
+          </w:tcPr>
+          <w:p>
+            <w:pPr>
+              <w:jc w:val="both"/>
+              <w:rPr>
+                <w:rFonts w:hint="default" w:ascii="Times New Roman" w:hAnsi="Times New Roman" w:eastAsia="Times New Roman" w:cs="Times New Roman"/>
+                <w:b w:val="0"/>
+                <w:bCs/>
+                <w:lang w:val="en-US"/>
+              </w:rPr>
+            </w:pPr>
+            <w:r>
+              <w:rPr>
+                <w:rFonts w:hint="default" w:ascii="Times New Roman" w:hAnsi="Times New Roman" w:eastAsia="SimSun" w:cs="Times New Roman"/>
+                <w:sz w:val="24"/>
+                <w:szCs w:val="24"/>
+              </w:rPr>
+              <w:t>Project Repository Structure</w:t>
+            </w:r>
+          </w:p>
+        </w:tc>
+        <w:tc>
+          <w:tcPr>
+            <w:tcW w:w="4650" w:type="dxa"/>
+          </w:tcPr>
+          <w:p>
+            <w:pPr>
+              <w:jc w:val="both"/>
+              <w:rPr>
+                <w:rFonts w:hint="default" w:ascii="Times New Roman" w:hAnsi="Times New Roman" w:eastAsia="Times New Roman" w:cs="Times New Roman"/>
+                <w:b w:val="0"/>
+                <w:bCs/>
+                <w:lang w:val="en-US"/>
+              </w:rPr>
+            </w:pPr>
+            <w:r>
+              <w:rPr>
+                <w:rFonts w:hint="default" w:ascii="Times New Roman" w:hAnsi="Times New Roman" w:eastAsia="SimSun" w:cs="Times New Roman"/>
+                <w:sz w:val="24"/>
+                <w:szCs w:val="24"/>
+              </w:rPr>
+              <w:t>Reviewed the current folder organization to ensure all team members can navigate the project easily.</w:t>
+            </w:r>
+          </w:p>
+        </w:tc>
+        <w:tc>
+          <w:tcPr>
+            <w:tcW w:w="4650" w:type="dxa"/>
+          </w:tcPr>
+          <w:p>
+            <w:pPr>
+              <w:jc w:val="both"/>
+              <w:rPr>
+                <w:rFonts w:hint="default" w:ascii="Times New Roman" w:hAnsi="Times New Roman" w:eastAsia="Times New Roman" w:cs="Times New Roman"/>
+                <w:b w:val="0"/>
+                <w:bCs/>
+                <w:lang w:val="en-US"/>
+              </w:rPr>
+            </w:pPr>
+            <w:r>
+              <w:rPr>
+                <w:rFonts w:hint="default" w:ascii="Times New Roman" w:hAnsi="Times New Roman" w:eastAsia="Times New Roman" w:cs="Times New Roman"/>
+                <w:b w:val="0"/>
+                <w:bCs/>
+                <w:lang w:val="en-US"/>
+              </w:rPr>
+              <w:t>Yes</w:t>
+            </w:r>
+          </w:p>
+        </w:tc>
+      </w:tr>
+      <w:tr>
+        <w:tblPrEx>
+          <w:tblBorders>
+            <w:top w:val="single" w:color="000000" w:sz="4" w:space="0"/>
+            <w:left w:val="single" w:color="000000" w:sz="4" w:space="0"/>
+            <w:bottom w:val="single" w:color="000000" w:sz="4" w:space="0"/>
+            <w:right w:val="single" w:color="000000" w:sz="4" w:space="0"/>
+            <w:insideH w:val="single" w:color="000000" w:sz="4" w:space="0"/>
+            <w:insideV w:val="single" w:color="000000" w:sz="4" w:space="0"/>
+          </w:tblBorders>
+          <w:tblCellMar>
+            <w:top w:w="0" w:type="dxa"/>
+            <w:left w:w="108" w:type="dxa"/>
+            <w:bottom w:w="0" w:type="dxa"/>
+            <w:right w:w="108" w:type="dxa"/>
+          </w:tblCellMar>
+        </w:tblPrEx>
+        <w:trPr>
+          <w:trHeight w:val="254" w:hRule="atLeast"/>
+        </w:trPr>
+        <w:tc>
+          <w:tcPr>
+            <w:tcW w:w="4650" w:type="dxa"/>
+          </w:tcPr>
+          <w:p>
+            <w:pPr>
+              <w:jc w:val="both"/>
+              <w:rPr>
+                <w:rFonts w:hint="default" w:ascii="Times New Roman" w:hAnsi="Times New Roman" w:eastAsia="SimSun" w:cs="Times New Roman"/>
+                <w:sz w:val="24"/>
+                <w:szCs w:val="24"/>
+              </w:rPr>
+            </w:pPr>
+            <w:r>
+              <w:rPr>
+                <w:rFonts w:hint="default" w:ascii="Times New Roman" w:hAnsi="Times New Roman" w:eastAsia="SimSun" w:cs="Times New Roman"/>
+                <w:sz w:val="24"/>
+                <w:szCs w:val="24"/>
+              </w:rPr>
+              <w:t>Documentation Standards</w:t>
+            </w:r>
+          </w:p>
+        </w:tc>
+        <w:tc>
+          <w:tcPr>
+            <w:tcW w:w="4650" w:type="dxa"/>
+          </w:tcPr>
+          <w:p>
+            <w:pPr>
+              <w:jc w:val="both"/>
+              <w:rPr>
+                <w:rFonts w:hint="default" w:ascii="Times New Roman" w:hAnsi="Times New Roman" w:eastAsia="SimSun" w:cs="Times New Roman"/>
+                <w:sz w:val="24"/>
+                <w:szCs w:val="24"/>
+              </w:rPr>
+            </w:pPr>
+            <w:r>
+              <w:rPr>
+                <w:rFonts w:hint="default" w:ascii="Times New Roman" w:hAnsi="Times New Roman" w:eastAsia="SimSun" w:cs="Times New Roman"/>
+                <w:sz w:val="24"/>
+                <w:szCs w:val="24"/>
+              </w:rPr>
+              <w:t>Discussion on the necessity of an updated README file to guide users and contributors.</w:t>
+            </w:r>
+          </w:p>
+        </w:tc>
+        <w:tc>
+          <w:tcPr>
+            <w:tcW w:w="4650" w:type="dxa"/>
+          </w:tcPr>
+          <w:p>
+            <w:pPr>
+              <w:jc w:val="both"/>
+              <w:rPr>
+                <w:rFonts w:hint="default" w:ascii="Times New Roman" w:hAnsi="Times New Roman" w:eastAsia="Times New Roman" w:cs="Times New Roman"/>
+                <w:b w:val="0"/>
+                <w:bCs/>
+                <w:lang w:val="en-US"/>
+              </w:rPr>
+            </w:pPr>
+            <w:r>
+              <w:rPr>
+                <w:rFonts w:hint="default" w:ascii="Times New Roman" w:hAnsi="Times New Roman" w:eastAsia="SimSun" w:cs="Times New Roman"/>
+                <w:sz w:val="24"/>
+                <w:szCs w:val="24"/>
+              </w:rPr>
+              <w:t>Yes</w:t>
+            </w:r>
+          </w:p>
+        </w:tc>
+      </w:tr>
+      <w:tr>
+        <w:tblPrEx>
+          <w:tblBorders>
+            <w:top w:val="single" w:color="000000" w:sz="4" w:space="0"/>
+            <w:left w:val="single" w:color="000000" w:sz="4" w:space="0"/>
+            <w:bottom w:val="single" w:color="000000" w:sz="4" w:space="0"/>
+            <w:right w:val="single" w:color="000000" w:sz="4" w:space="0"/>
+            <w:insideH w:val="single" w:color="000000" w:sz="4" w:space="0"/>
+            <w:insideV w:val="single" w:color="000000" w:sz="4" w:space="0"/>
+          </w:tblBorders>
+          <w:tblCellMar>
+            <w:top w:w="0" w:type="dxa"/>
+            <w:left w:w="108" w:type="dxa"/>
+            <w:bottom w:w="0" w:type="dxa"/>
+            <w:right w:w="108" w:type="dxa"/>
+          </w:tblCellMar>
+        </w:tblPrEx>
+        <w:trPr>
+          <w:trHeight w:val="254" w:hRule="atLeast"/>
+        </w:trPr>
+        <w:tc>
+          <w:tcPr>
+            <w:tcW w:w="4650" w:type="dxa"/>
+          </w:tcPr>
+          <w:p>
+            <w:pPr>
+              <w:jc w:val="both"/>
+              <w:rPr>
+                <w:rFonts w:hint="default" w:ascii="Times New Roman" w:hAnsi="Times New Roman" w:eastAsia="SimSun" w:cs="Times New Roman"/>
+                <w:sz w:val="24"/>
+                <w:szCs w:val="24"/>
+              </w:rPr>
+            </w:pPr>
+            <w:r>
+              <w:rPr>
+                <w:rFonts w:hint="default" w:ascii="Times New Roman" w:hAnsi="Times New Roman" w:eastAsia="SimSun" w:cs="Times New Roman"/>
+                <w:sz w:val="24"/>
+                <w:szCs w:val="24"/>
+              </w:rPr>
+              <w:t>Confirmation of minutes from last meeting:</w:t>
+            </w:r>
+          </w:p>
+        </w:tc>
+        <w:tc>
+          <w:tcPr>
+            <w:tcW w:w="4650" w:type="dxa"/>
+          </w:tcPr>
+          <w:p>
+            <w:pPr>
+              <w:jc w:val="both"/>
+              <w:rPr>
+                <w:rFonts w:hint="default" w:ascii="Times New Roman" w:hAnsi="Times New Roman" w:eastAsia="SimSun" w:cs="Times New Roman"/>
+                <w:sz w:val="24"/>
+                <w:szCs w:val="24"/>
+              </w:rPr>
+            </w:pPr>
+            <w:r>
+              <w:rPr>
+                <w:rFonts w:hint="default" w:ascii="Times New Roman" w:hAnsi="Times New Roman" w:eastAsia="SimSun" w:cs="Times New Roman"/>
+                <w:sz w:val="24"/>
+                <w:szCs w:val="24"/>
+              </w:rPr>
+              <w:t>Yes</w:t>
+            </w:r>
+          </w:p>
+        </w:tc>
+        <w:tc>
+          <w:tcPr>
+            <w:tcW w:w="4650" w:type="dxa"/>
+          </w:tcPr>
+          <w:p>
+            <w:pPr>
+              <w:jc w:val="both"/>
+              <w:rPr>
+                <w:rFonts w:hint="default" w:ascii="Times New Roman" w:hAnsi="Times New Roman" w:eastAsia="SimSun" w:cs="Times New Roman"/>
+                <w:sz w:val="24"/>
+                <w:szCs w:val="24"/>
+              </w:rPr>
+            </w:pPr>
+            <w:r>
+              <w:rPr>
+                <w:rFonts w:hint="default" w:ascii="Times New Roman" w:hAnsi="Times New Roman" w:eastAsia="SimSun" w:cs="Times New Roman"/>
+                <w:sz w:val="24"/>
+                <w:szCs w:val="24"/>
+              </w:rPr>
+              <w:t>No</w:t>
+            </w:r>
+          </w:p>
+        </w:tc>
+      </w:tr>
+    </w:tbl>
+    <w:p>
+      <w:pPr>
+        <w:jc w:val="both"/>
+        <w:rPr>
+          <w:rFonts w:hint="default" w:ascii="Times New Roman" w:hAnsi="Times New Roman" w:eastAsia="Times New Roman" w:cs="Times New Roman"/>
+          <w:b/>
+        </w:rPr>
+      </w:pPr>
+      <w:r>
+        <w:rPr>
+          <w:rFonts w:hint="default" w:ascii="Times New Roman" w:hAnsi="Times New Roman" w:eastAsia="Times New Roman" w:cs="Times New Roman"/>
+          <w:b/>
+        </w:rPr>
+        <w:t xml:space="preserve">Confirmation of minutes from last meeting:                                    </w:t>
+      </w:r>
+      <w:r>
+        <w:rPr>
+          <w:rFonts w:hint="default" w:ascii="Times New Roman" w:hAnsi="Times New Roman" w:eastAsia="Times New Roman" w:cs="Times New Roman"/>
+          <w:b/>
+          <w:highlight w:val="cyan"/>
+        </w:rPr>
+        <w:t>Yes</w:t>
+      </w:r>
+      <w:r>
+        <w:rPr>
+          <w:rFonts w:hint="default" w:ascii="Times New Roman" w:hAnsi="Times New Roman" w:eastAsia="Times New Roman" w:cs="Times New Roman"/>
+          <w:b/>
+        </w:rPr>
+        <w:t xml:space="preserve">                              </w:t>
+      </w:r>
+      <w:r>
+        <w:rPr>
+          <w:rFonts w:hint="default" w:ascii="Times New Roman" w:hAnsi="Times New Roman" w:eastAsia="Times New Roman" w:cs="Times New Roman"/>
+          <w:b/>
+          <w:highlight w:val="none"/>
+        </w:rPr>
+        <w:t xml:space="preserve">     No   </w:t>
+      </w:r>
+    </w:p>
+    <w:p>
+      <w:pPr>
+        <w:jc w:val="both"/>
+        <w:rPr>
+          <w:rFonts w:hint="default" w:ascii="Times New Roman" w:hAnsi="Times New Roman" w:eastAsia="Times New Roman" w:cs="Times New Roman"/>
+          <w:b/>
+        </w:rPr>
+      </w:pPr>
+    </w:p>
+    <w:p>
+      <w:pPr>
+        <w:jc w:val="both"/>
+        <w:rPr>
+          <w:rFonts w:hint="default" w:ascii="Times New Roman" w:hAnsi="Times New Roman" w:eastAsia="Times New Roman" w:cs="Times New Roman"/>
+          <w:b/>
+        </w:rPr>
+      </w:pPr>
+      <w:r>
+        <w:rPr>
+          <w:rFonts w:hint="default" w:ascii="Times New Roman" w:hAnsi="Times New Roman" w:eastAsia="Times New Roman" w:cs="Times New Roman"/>
+          <w:b/>
+        </w:rPr>
+        <w:t>Outcome of meeting:</w:t>
+      </w:r>
+    </w:p>
+    <w:tbl>
+      <w:tblPr>
+        <w:tblStyle w:val="12"/>
+        <w:tblW w:w="13950" w:type="dxa"/>
+        <w:tblInd w:w="0" w:type="dxa"/>
+        <w:tblBorders>
+          <w:top w:val="single" w:color="000000" w:sz="4" w:space="0"/>
+          <w:left w:val="single" w:color="000000" w:sz="4" w:space="0"/>
+          <w:bottom w:val="single" w:color="000000" w:sz="4" w:space="0"/>
+          <w:right w:val="single" w:color="000000" w:sz="4" w:space="0"/>
+          <w:insideH w:val="single" w:color="000000" w:sz="4" w:space="0"/>
+          <w:insideV w:val="single" w:color="000000" w:sz="4" w:space="0"/>
+        </w:tblBorders>
+        <w:tblLayout w:type="fixed"/>
+        <w:tblCellMar>
+          <w:top w:w="0" w:type="dxa"/>
+          <w:left w:w="108" w:type="dxa"/>
+          <w:bottom w:w="0" w:type="dxa"/>
+          <w:right w:w="108" w:type="dxa"/>
+        </w:tblCellMar>
+      </w:tblPr>
+      <w:tblGrid>
+        <w:gridCol w:w="2625"/>
+        <w:gridCol w:w="3539"/>
+        <w:gridCol w:w="3944"/>
+        <w:gridCol w:w="3842"/>
+      </w:tblGrid>
+      <w:tr>
+        <w:tblPrEx>
+          <w:tblBorders>
+            <w:top w:val="single" w:color="000000" w:sz="4" w:space="0"/>
+            <w:left w:val="single" w:color="000000" w:sz="4" w:space="0"/>
+            <w:bottom w:val="single" w:color="000000" w:sz="4" w:space="0"/>
+            <w:right w:val="single" w:color="000000" w:sz="4" w:space="0"/>
+            <w:insideH w:val="single" w:color="000000" w:sz="4" w:space="0"/>
+            <w:insideV w:val="single" w:color="000000" w:sz="4" w:space="0"/>
+          </w:tblBorders>
+          <w:tblCellMar>
+            <w:top w:w="0" w:type="dxa"/>
+            <w:left w:w="108" w:type="dxa"/>
+            <w:bottom w:w="0" w:type="dxa"/>
+            <w:right w:w="108" w:type="dxa"/>
+          </w:tblCellMar>
+        </w:tblPrEx>
+        <w:tc>
+          <w:tcPr>
+            <w:tcW w:w="2625" w:type="dxa"/>
+          </w:tcPr>
+          <w:p>
+            <w:pPr>
+              <w:jc w:val="both"/>
+              <w:rPr>
+                <w:rFonts w:hint="default" w:ascii="Times New Roman" w:hAnsi="Times New Roman" w:eastAsia="Times New Roman" w:cs="Times New Roman"/>
+                <w:b/>
+              </w:rPr>
+            </w:pPr>
+            <w:r>
+              <w:rPr>
+                <w:rFonts w:hint="default" w:ascii="Times New Roman" w:hAnsi="Times New Roman" w:eastAsia="Times New Roman" w:cs="Times New Roman"/>
+                <w:b/>
+              </w:rPr>
+              <w:t>Issue</w:t>
+            </w:r>
+          </w:p>
+        </w:tc>
+        <w:tc>
+          <w:tcPr>
+            <w:tcW w:w="3539" w:type="dxa"/>
+          </w:tcPr>
+          <w:p>
+            <w:pPr>
+              <w:jc w:val="both"/>
+              <w:rPr>
+                <w:rFonts w:hint="default" w:ascii="Times New Roman" w:hAnsi="Times New Roman" w:eastAsia="Times New Roman" w:cs="Times New Roman"/>
+                <w:b/>
+              </w:rPr>
+            </w:pPr>
+            <w:r>
+              <w:rPr>
+                <w:rFonts w:hint="default" w:ascii="Times New Roman" w:hAnsi="Times New Roman" w:eastAsia="Times New Roman" w:cs="Times New Roman"/>
+                <w:b/>
+              </w:rPr>
+              <w:t>Discussion in brief</w:t>
+            </w:r>
+          </w:p>
+        </w:tc>
+        <w:tc>
+          <w:tcPr>
+            <w:tcW w:w="3944" w:type="dxa"/>
+          </w:tcPr>
+          <w:p>
+            <w:pPr>
+              <w:jc w:val="both"/>
+              <w:rPr>
+                <w:rFonts w:hint="default" w:ascii="Times New Roman" w:hAnsi="Times New Roman" w:eastAsia="Times New Roman" w:cs="Times New Roman"/>
+                <w:b/>
+              </w:rPr>
+            </w:pPr>
+            <w:r>
+              <w:rPr>
+                <w:rFonts w:hint="default" w:ascii="Times New Roman" w:hAnsi="Times New Roman" w:eastAsia="Times New Roman" w:cs="Times New Roman"/>
+                <w:b/>
+              </w:rPr>
+              <w:t>Outcome</w:t>
+            </w:r>
+          </w:p>
+        </w:tc>
+        <w:tc>
+          <w:tcPr>
+            <w:tcW w:w="3842" w:type="dxa"/>
+          </w:tcPr>
+          <w:p>
+            <w:pPr>
+              <w:jc w:val="both"/>
+              <w:rPr>
+                <w:rFonts w:hint="default" w:ascii="Times New Roman" w:hAnsi="Times New Roman" w:eastAsia="Times New Roman" w:cs="Times New Roman"/>
+                <w:b/>
+              </w:rPr>
+            </w:pPr>
+            <w:r>
+              <w:rPr>
+                <w:rFonts w:hint="default" w:ascii="Times New Roman" w:hAnsi="Times New Roman" w:eastAsia="Times New Roman" w:cs="Times New Roman"/>
+                <w:b/>
+              </w:rPr>
+              <w:t>Action: Name and Timeline</w:t>
+            </w:r>
+          </w:p>
+        </w:tc>
+      </w:tr>
+      <w:tr>
+        <w:tblPrEx>
+          <w:tblBorders>
+            <w:top w:val="single" w:color="000000" w:sz="4" w:space="0"/>
+            <w:left w:val="single" w:color="000000" w:sz="4" w:space="0"/>
+            <w:bottom w:val="single" w:color="000000" w:sz="4" w:space="0"/>
+            <w:right w:val="single" w:color="000000" w:sz="4" w:space="0"/>
+            <w:insideH w:val="single" w:color="000000" w:sz="4" w:space="0"/>
+            <w:insideV w:val="single" w:color="000000" w:sz="4" w:space="0"/>
+          </w:tblBorders>
+          <w:tblCellMar>
+            <w:top w:w="0" w:type="dxa"/>
+            <w:left w:w="108" w:type="dxa"/>
+            <w:bottom w:w="0" w:type="dxa"/>
+            <w:right w:w="108" w:type="dxa"/>
+          </w:tblCellMar>
+        </w:tblPrEx>
+        <w:trPr>
+          <w:trHeight w:val="1087" w:hRule="atLeast"/>
+        </w:trPr>
+        <w:tc>
+          <w:tcPr>
+            <w:tcW w:w="2625" w:type="dxa"/>
+          </w:tcPr>
+          <w:p>
+            <w:pPr>
+              <w:jc w:val="left"/>
+              <w:rPr>
+                <w:rFonts w:hint="default" w:ascii="Times New Roman" w:hAnsi="Times New Roman" w:eastAsia="Times New Roman" w:cs="Times New Roman"/>
+                <w:b w:val="0"/>
+                <w:bCs w:val="0"/>
+                <w:lang w:val="en-US"/>
+              </w:rPr>
+            </w:pPr>
+            <w:r>
+              <w:rPr>
+                <w:rFonts w:hint="default" w:ascii="Times New Roman" w:hAnsi="Times New Roman" w:eastAsia="SimSun" w:cs="Times New Roman"/>
+                <w:b w:val="0"/>
+                <w:bCs w:val="0"/>
+                <w:sz w:val="24"/>
+                <w:szCs w:val="24"/>
+              </w:rPr>
+              <w:t>Model Selection for Detection</w:t>
+            </w:r>
+          </w:p>
+        </w:tc>
+        <w:tc>
+          <w:tcPr>
+            <w:tcW w:w="3539" w:type="dxa"/>
+          </w:tcPr>
+          <w:p>
+            <w:pPr>
+              <w:jc w:val="both"/>
+              <w:rPr>
+                <w:rFonts w:hint="default" w:ascii="Times New Roman" w:hAnsi="Times New Roman" w:eastAsia="Times New Roman" w:cs="Times New Roman"/>
+                <w:b w:val="0"/>
+                <w:bCs w:val="0"/>
+                <w:lang w:val="en-US"/>
+              </w:rPr>
+            </w:pPr>
+            <w:r>
+              <w:rPr>
+                <w:rFonts w:hint="default" w:ascii="Times New Roman" w:hAnsi="Times New Roman" w:eastAsia="SimSun" w:cs="Times New Roman"/>
+                <w:b w:val="0"/>
+                <w:bCs w:val="0"/>
+                <w:sz w:val="24"/>
+                <w:szCs w:val="24"/>
+              </w:rPr>
+              <w:t>Evaluated models for three categories: Spam/Ham, Malware, and Newspaper classification.</w:t>
+            </w:r>
+          </w:p>
+        </w:tc>
+        <w:tc>
+          <w:tcPr>
+            <w:tcW w:w="3944" w:type="dxa"/>
+          </w:tcPr>
+          <w:p>
+            <w:pPr>
+              <w:jc w:val="both"/>
+              <w:rPr>
+                <w:rFonts w:hint="default" w:ascii="Times New Roman" w:hAnsi="Times New Roman" w:eastAsia="Times New Roman" w:cs="Times New Roman"/>
+                <w:b w:val="0"/>
+                <w:bCs w:val="0"/>
+                <w:lang w:val="en-US"/>
+              </w:rPr>
+            </w:pPr>
+            <w:r>
+              <w:rPr>
+                <w:rFonts w:hint="default" w:ascii="Times New Roman" w:hAnsi="Times New Roman" w:eastAsia="SimSun" w:cs="Times New Roman"/>
+                <w:b w:val="0"/>
+                <w:bCs w:val="0"/>
+                <w:sz w:val="24"/>
+                <w:szCs w:val="24"/>
+              </w:rPr>
+              <w:t>Linear SVM (Spam/Ham), Random Forest (Malware), Newspaper (Pending).</w:t>
+            </w:r>
+          </w:p>
+        </w:tc>
+        <w:tc>
+          <w:tcPr>
+            <w:tcW w:w="3842" w:type="dxa"/>
+          </w:tcPr>
+          <w:p>
+            <w:pPr>
+              <w:jc w:val="both"/>
+              <w:rPr>
+                <w:rFonts w:hint="default" w:ascii="Times New Roman" w:hAnsi="Times New Roman" w:eastAsia="Times New Roman" w:cs="Times New Roman"/>
+                <w:b w:val="0"/>
+                <w:bCs w:val="0"/>
+                <w:lang w:val="en-US"/>
+              </w:rPr>
+            </w:pPr>
+            <w:r>
+              <w:rPr>
+                <w:rFonts w:hint="default" w:ascii="Times New Roman" w:hAnsi="Times New Roman" w:eastAsia="SimSun" w:cs="Times New Roman"/>
+                <w:b w:val="0"/>
+                <w:bCs w:val="0"/>
+                <w:sz w:val="24"/>
+                <w:szCs w:val="24"/>
+              </w:rPr>
+              <w:t>All Members: Implement and test selected models by next meeting.</w:t>
+            </w:r>
+          </w:p>
+        </w:tc>
+      </w:tr>
+      <w:tr>
+        <w:tblPrEx>
+          <w:tblBorders>
+            <w:top w:val="single" w:color="000000" w:sz="4" w:space="0"/>
+            <w:left w:val="single" w:color="000000" w:sz="4" w:space="0"/>
+            <w:bottom w:val="single" w:color="000000" w:sz="4" w:space="0"/>
+            <w:right w:val="single" w:color="000000" w:sz="4" w:space="0"/>
+            <w:insideH w:val="single" w:color="000000" w:sz="4" w:space="0"/>
+            <w:insideV w:val="single" w:color="000000" w:sz="4" w:space="0"/>
+          </w:tblBorders>
+          <w:tblCellMar>
+            <w:top w:w="0" w:type="dxa"/>
+            <w:left w:w="108" w:type="dxa"/>
+            <w:bottom w:w="0" w:type="dxa"/>
+            <w:right w:w="108" w:type="dxa"/>
+          </w:tblCellMar>
+        </w:tblPrEx>
+        <w:trPr>
+          <w:trHeight w:val="1046" w:hRule="atLeast"/>
+        </w:trPr>
+        <w:tc>
+          <w:tcPr>
+            <w:tcW w:w="2625" w:type="dxa"/>
+          </w:tcPr>
+          <w:p>
+            <w:pPr>
+              <w:jc w:val="both"/>
+              <w:rPr>
+                <w:rFonts w:hint="default" w:ascii="Times New Roman" w:hAnsi="Times New Roman" w:eastAsia="Times New Roman" w:cs="Times New Roman"/>
+                <w:b w:val="0"/>
+                <w:bCs w:val="0"/>
+                <w:lang w:val="en-US"/>
+              </w:rPr>
+            </w:pPr>
+            <w:r>
+              <w:rPr>
+                <w:rFonts w:hint="default" w:ascii="Times New Roman" w:hAnsi="Times New Roman" w:eastAsia="SimSun" w:cs="Times New Roman"/>
+                <w:b w:val="0"/>
+                <w:bCs w:val="0"/>
+                <w:sz w:val="24"/>
+                <w:szCs w:val="24"/>
+              </w:rPr>
+              <w:t>Handling Large Datasets</w:t>
+            </w:r>
+          </w:p>
+        </w:tc>
+        <w:tc>
+          <w:tcPr>
+            <w:tcW w:w="3539" w:type="dxa"/>
+          </w:tcPr>
+          <w:p>
+            <w:pPr>
+              <w:jc w:val="both"/>
+              <w:rPr>
+                <w:rFonts w:hint="default" w:ascii="Times New Roman" w:hAnsi="Times New Roman" w:eastAsia="Times New Roman" w:cs="Times New Roman"/>
+                <w:b w:val="0"/>
+                <w:bCs w:val="0"/>
+                <w:lang w:val="en-US"/>
+              </w:rPr>
+            </w:pPr>
+            <w:r>
+              <w:rPr>
+                <w:rFonts w:hint="default" w:ascii="Times New Roman" w:hAnsi="Times New Roman" w:eastAsia="SimSun" w:cs="Times New Roman"/>
+                <w:b w:val="0"/>
+                <w:bCs w:val="0"/>
+                <w:sz w:val="24"/>
+                <w:szCs w:val="24"/>
+              </w:rPr>
+              <w:t>Discussed current technical limitations and performance bottlenecks when processing large data volumes.</w:t>
+            </w:r>
+          </w:p>
+        </w:tc>
+        <w:tc>
+          <w:tcPr>
+            <w:tcW w:w="3944" w:type="dxa"/>
+          </w:tcPr>
+          <w:p>
+            <w:pPr>
+              <w:jc w:val="both"/>
+              <w:rPr>
+                <w:rFonts w:hint="default" w:ascii="Times New Roman" w:hAnsi="Times New Roman" w:eastAsia="Times New Roman" w:cs="Times New Roman"/>
+                <w:b w:val="0"/>
+                <w:bCs w:val="0"/>
+                <w:lang w:val="en-US"/>
+              </w:rPr>
+            </w:pPr>
+            <w:r>
+              <w:rPr>
+                <w:rFonts w:hint="default" w:ascii="Times New Roman" w:hAnsi="Times New Roman" w:eastAsia="SimSun" w:cs="Times New Roman"/>
+                <w:b w:val="0"/>
+                <w:bCs w:val="0"/>
+                <w:sz w:val="24"/>
+                <w:szCs w:val="24"/>
+              </w:rPr>
+              <w:t>Team-wide research task initiated to find a scalable solution.</w:t>
+            </w:r>
+          </w:p>
+        </w:tc>
+        <w:tc>
+          <w:tcPr>
+            <w:tcW w:w="3842" w:type="dxa"/>
+          </w:tcPr>
+          <w:p>
+            <w:pPr>
+              <w:jc w:val="both"/>
+              <w:rPr>
+                <w:rFonts w:hint="default" w:ascii="Times New Roman" w:hAnsi="Times New Roman" w:cs="Times New Roman"/>
+                <w:b w:val="0"/>
+                <w:bCs w:val="0"/>
+                <w:sz w:val="24"/>
+                <w:szCs w:val="24"/>
+                <w:lang w:val="en-US"/>
+              </w:rPr>
+            </w:pPr>
+            <w:r>
+              <w:rPr>
+                <w:rFonts w:hint="default" w:ascii="Times New Roman" w:hAnsi="Times New Roman" w:eastAsia="SimSun" w:cs="Times New Roman"/>
+                <w:b w:val="0"/>
+                <w:bCs w:val="0"/>
+                <w:sz w:val="24"/>
+                <w:szCs w:val="24"/>
+              </w:rPr>
+              <w:t>Whole Team: Research and propose solution within 1 day.</w:t>
+            </w:r>
+          </w:p>
+        </w:tc>
+      </w:tr>
+      <w:tr>
+        <w:tblPrEx>
+          <w:tblBorders>
+            <w:top w:val="single" w:color="000000" w:sz="4" w:space="0"/>
+            <w:left w:val="single" w:color="000000" w:sz="4" w:space="0"/>
+            <w:bottom w:val="single" w:color="000000" w:sz="4" w:space="0"/>
+            <w:right w:val="single" w:color="000000" w:sz="4" w:space="0"/>
+            <w:insideH w:val="single" w:color="000000" w:sz="4" w:space="0"/>
+            <w:insideV w:val="single" w:color="000000" w:sz="4" w:space="0"/>
+          </w:tblBorders>
+          <w:tblCellMar>
+            <w:top w:w="0" w:type="dxa"/>
+            <w:left w:w="108" w:type="dxa"/>
+            <w:bottom w:w="0" w:type="dxa"/>
+            <w:right w:w="108" w:type="dxa"/>
+          </w:tblCellMar>
+        </w:tblPrEx>
+        <w:trPr>
+          <w:trHeight w:val="1092" w:hRule="atLeast"/>
+        </w:trPr>
+        <w:tc>
+          <w:tcPr>
+            <w:tcW w:w="2625" w:type="dxa"/>
+          </w:tcPr>
+          <w:p>
+            <w:pPr>
+              <w:jc w:val="both"/>
+              <w:rPr>
+                <w:rFonts w:hint="default" w:ascii="Times New Roman" w:hAnsi="Times New Roman" w:eastAsia="SimSun" w:cs="Times New Roman"/>
+                <w:b w:val="0"/>
+                <w:bCs w:val="0"/>
+                <w:sz w:val="24"/>
+                <w:szCs w:val="24"/>
+              </w:rPr>
+            </w:pPr>
+            <w:r>
+              <w:rPr>
+                <w:rFonts w:hint="default" w:ascii="Times New Roman" w:hAnsi="Times New Roman" w:eastAsia="SimSun" w:cs="Times New Roman"/>
+                <w:b w:val="0"/>
+                <w:bCs w:val="0"/>
+                <w:sz w:val="24"/>
+                <w:szCs w:val="24"/>
+              </w:rPr>
+              <w:t>Second Report Structure</w:t>
+            </w:r>
+          </w:p>
+        </w:tc>
+        <w:tc>
+          <w:tcPr>
+            <w:tcW w:w="3539" w:type="dxa"/>
+          </w:tcPr>
+          <w:p>
+            <w:pPr>
+              <w:jc w:val="both"/>
+              <w:rPr>
+                <w:rFonts w:hint="default" w:ascii="Times New Roman" w:hAnsi="Times New Roman" w:eastAsia="SimSun" w:cs="Times New Roman"/>
+                <w:b w:val="0"/>
+                <w:bCs w:val="0"/>
+                <w:sz w:val="24"/>
+                <w:szCs w:val="24"/>
+              </w:rPr>
+            </w:pPr>
+            <w:r>
+              <w:rPr>
+                <w:rFonts w:hint="default" w:ascii="Times New Roman" w:hAnsi="Times New Roman" w:eastAsia="SimSun" w:cs="Times New Roman"/>
+                <w:b w:val="0"/>
+                <w:bCs w:val="0"/>
+                <w:sz w:val="24"/>
+                <w:szCs w:val="24"/>
+              </w:rPr>
+              <w:t>Defined the necessary sections and Table of Contents for the upcoming project milestone.</w:t>
+            </w:r>
+          </w:p>
+        </w:tc>
+        <w:tc>
+          <w:tcPr>
+            <w:tcW w:w="3944" w:type="dxa"/>
+          </w:tcPr>
+          <w:p>
+            <w:pPr>
+              <w:jc w:val="both"/>
+              <w:rPr>
+                <w:rFonts w:hint="default" w:ascii="Times New Roman" w:hAnsi="Times New Roman" w:eastAsia="SimSun" w:cs="Times New Roman"/>
+                <w:b w:val="0"/>
+                <w:bCs w:val="0"/>
+                <w:sz w:val="24"/>
+                <w:szCs w:val="24"/>
+              </w:rPr>
+            </w:pPr>
+            <w:r>
+              <w:rPr>
+                <w:rFonts w:hint="default" w:ascii="Times New Roman" w:hAnsi="Times New Roman" w:eastAsia="SimSun" w:cs="Times New Roman"/>
+                <w:b w:val="0"/>
+                <w:bCs w:val="0"/>
+                <w:sz w:val="24"/>
+                <w:szCs w:val="24"/>
+              </w:rPr>
+              <w:t>Table of Contents finalized; Dang assigned as lead.</w:t>
+            </w:r>
+          </w:p>
+        </w:tc>
+        <w:tc>
+          <w:tcPr>
+            <w:tcW w:w="3842" w:type="dxa"/>
+          </w:tcPr>
+          <w:p>
+            <w:pPr>
+              <w:jc w:val="both"/>
+              <w:rPr>
+                <w:rFonts w:hint="default" w:ascii="Times New Roman" w:hAnsi="Times New Roman" w:eastAsia="SimSun" w:cs="Times New Roman"/>
+                <w:b w:val="0"/>
+                <w:bCs w:val="0"/>
+                <w:sz w:val="24"/>
+                <w:szCs w:val="24"/>
+              </w:rPr>
+            </w:pPr>
+            <w:r>
+              <w:rPr>
+                <w:rFonts w:hint="default" w:ascii="Times New Roman" w:hAnsi="Times New Roman" w:eastAsia="SimSun" w:cs="Times New Roman"/>
+                <w:b w:val="0"/>
+                <w:bCs w:val="0"/>
+                <w:sz w:val="24"/>
+                <w:szCs w:val="24"/>
+              </w:rPr>
+              <w:t>Dang: Draft the report based on ToC within 3 days</w:t>
+            </w:r>
+          </w:p>
+        </w:tc>
+      </w:tr>
+      <w:tr>
+        <w:tblPrEx>
+          <w:tblBorders>
+            <w:top w:val="single" w:color="000000" w:sz="4" w:space="0"/>
+            <w:left w:val="single" w:color="000000" w:sz="4" w:space="0"/>
+            <w:bottom w:val="single" w:color="000000" w:sz="4" w:space="0"/>
+            <w:right w:val="single" w:color="000000" w:sz="4" w:space="0"/>
+            <w:insideH w:val="single" w:color="000000" w:sz="4" w:space="0"/>
+            <w:insideV w:val="single" w:color="000000" w:sz="4" w:space="0"/>
+          </w:tblBorders>
+          <w:tblCellMar>
+            <w:top w:w="0" w:type="dxa"/>
+            <w:left w:w="108" w:type="dxa"/>
+            <w:bottom w:w="0" w:type="dxa"/>
+            <w:right w:w="108" w:type="dxa"/>
+          </w:tblCellMar>
+        </w:tblPrEx>
+        <w:trPr>
+          <w:trHeight w:val="1092" w:hRule="atLeast"/>
+        </w:trPr>
+        <w:tc>
+          <w:tcPr>
+            <w:tcW w:w="2625" w:type="dxa"/>
+          </w:tcPr>
+          <w:p>
+            <w:pPr>
+              <w:jc w:val="both"/>
+              <w:rPr>
+                <w:rFonts w:hint="default" w:ascii="Times New Roman" w:hAnsi="Times New Roman" w:eastAsia="SimSun" w:cs="Times New Roman"/>
+                <w:b w:val="0"/>
+                <w:bCs w:val="0"/>
+                <w:sz w:val="24"/>
+                <w:szCs w:val="24"/>
+              </w:rPr>
+            </w:pPr>
+            <w:r>
+              <w:rPr>
+                <w:rFonts w:hint="default" w:ascii="Times New Roman" w:hAnsi="Times New Roman" w:eastAsia="SimSun" w:cs="Times New Roman"/>
+                <w:b w:val="0"/>
+                <w:bCs w:val="0"/>
+                <w:sz w:val="24"/>
+                <w:szCs w:val="24"/>
+              </w:rPr>
+              <w:t>Meeting Documentation</w:t>
+            </w:r>
+          </w:p>
+        </w:tc>
+        <w:tc>
+          <w:tcPr>
+            <w:tcW w:w="3539" w:type="dxa"/>
+          </w:tcPr>
+          <w:p>
+            <w:pPr>
+              <w:jc w:val="both"/>
+              <w:rPr>
+                <w:rFonts w:hint="default" w:ascii="Times New Roman" w:hAnsi="Times New Roman" w:eastAsia="SimSun" w:cs="Times New Roman"/>
+                <w:b w:val="0"/>
+                <w:bCs w:val="0"/>
+                <w:sz w:val="24"/>
+                <w:szCs w:val="24"/>
+              </w:rPr>
+            </w:pPr>
+            <w:r>
+              <w:rPr>
+                <w:rFonts w:hint="default" w:ascii="Times New Roman" w:hAnsi="Times New Roman" w:eastAsia="SimSun" w:cs="Times New Roman"/>
+                <w:b w:val="0"/>
+                <w:bCs w:val="0"/>
+                <w:sz w:val="24"/>
+                <w:szCs w:val="24"/>
+              </w:rPr>
+              <w:t>Requirement for consistent Minutes of Meeting (MoM) to track progress and decisions.</w:t>
+            </w:r>
+          </w:p>
+        </w:tc>
+        <w:tc>
+          <w:tcPr>
+            <w:tcW w:w="3944" w:type="dxa"/>
+          </w:tcPr>
+          <w:p>
+            <w:pPr>
+              <w:jc w:val="both"/>
+              <w:rPr>
+                <w:rFonts w:hint="default" w:ascii="Times New Roman" w:hAnsi="Times New Roman" w:eastAsia="SimSun" w:cs="Times New Roman"/>
+                <w:b w:val="0"/>
+                <w:bCs w:val="0"/>
+                <w:sz w:val="24"/>
+                <w:szCs w:val="24"/>
+              </w:rPr>
+            </w:pPr>
+            <w:r>
+              <w:rPr>
+                <w:rFonts w:hint="default" w:ascii="Times New Roman" w:hAnsi="Times New Roman" w:eastAsia="SimSun" w:cs="Times New Roman"/>
+                <w:b w:val="0"/>
+                <w:bCs w:val="0"/>
+                <w:sz w:val="24"/>
+                <w:szCs w:val="24"/>
+              </w:rPr>
+              <w:t>Leo Anh appointed as the official note-taker for all meetings.</w:t>
+            </w:r>
+          </w:p>
+        </w:tc>
+        <w:tc>
+          <w:tcPr>
+            <w:tcW w:w="3842" w:type="dxa"/>
+          </w:tcPr>
+          <w:p>
+            <w:pPr>
+              <w:jc w:val="both"/>
+              <w:rPr>
+                <w:rFonts w:hint="default" w:ascii="Times New Roman" w:hAnsi="Times New Roman" w:eastAsia="SimSun" w:cs="Times New Roman"/>
+                <w:b w:val="0"/>
+                <w:bCs w:val="0"/>
+                <w:sz w:val="24"/>
+                <w:szCs w:val="24"/>
+              </w:rPr>
+            </w:pPr>
+            <w:r>
+              <w:rPr>
+                <w:rFonts w:hint="default" w:ascii="Times New Roman" w:hAnsi="Times New Roman" w:eastAsia="SimSun" w:cs="Times New Roman"/>
+                <w:b w:val="0"/>
+                <w:bCs w:val="0"/>
+                <w:sz w:val="24"/>
+                <w:szCs w:val="24"/>
+              </w:rPr>
+              <w:t>Leo Anh: Distribute MoM within 24 hours post-meeting.</w:t>
+            </w:r>
+          </w:p>
+        </w:tc>
+      </w:tr>
+      <w:tr>
+        <w:tblPrEx>
+          <w:tblBorders>
+            <w:top w:val="single" w:color="000000" w:sz="4" w:space="0"/>
+            <w:left w:val="single" w:color="000000" w:sz="4" w:space="0"/>
+            <w:bottom w:val="single" w:color="000000" w:sz="4" w:space="0"/>
+            <w:right w:val="single" w:color="000000" w:sz="4" w:space="0"/>
+            <w:insideH w:val="single" w:color="000000" w:sz="4" w:space="0"/>
+            <w:insideV w:val="single" w:color="000000" w:sz="4" w:space="0"/>
+          </w:tblBorders>
+          <w:tblCellMar>
+            <w:top w:w="0" w:type="dxa"/>
+            <w:left w:w="108" w:type="dxa"/>
+            <w:bottom w:w="0" w:type="dxa"/>
+            <w:right w:w="108" w:type="dxa"/>
+          </w:tblCellMar>
+        </w:tblPrEx>
+        <w:trPr>
+          <w:trHeight w:val="1092" w:hRule="atLeast"/>
+        </w:trPr>
+        <w:tc>
+          <w:tcPr>
+            <w:tcW w:w="2625" w:type="dxa"/>
+          </w:tcPr>
+          <w:p>
+            <w:pPr>
+              <w:jc w:val="both"/>
+              <w:rPr>
+                <w:rFonts w:hint="default" w:ascii="Times New Roman" w:hAnsi="Times New Roman" w:eastAsia="SimSun" w:cs="Times New Roman"/>
+                <w:b w:val="0"/>
+                <w:bCs w:val="0"/>
+                <w:sz w:val="24"/>
+                <w:szCs w:val="24"/>
+              </w:rPr>
+            </w:pPr>
+            <w:r>
+              <w:rPr>
+                <w:rFonts w:hint="default" w:ascii="Times New Roman" w:hAnsi="Times New Roman" w:eastAsia="SimSun" w:cs="Times New Roman"/>
+                <w:b w:val="0"/>
+                <w:bCs w:val="0"/>
+                <w:sz w:val="24"/>
+                <w:szCs w:val="24"/>
+              </w:rPr>
+              <w:t>README File Update</w:t>
+            </w:r>
+          </w:p>
+        </w:tc>
+        <w:tc>
+          <w:tcPr>
+            <w:tcW w:w="3539" w:type="dxa"/>
+          </w:tcPr>
+          <w:p>
+            <w:pPr>
+              <w:jc w:val="both"/>
+              <w:rPr>
+                <w:rFonts w:hint="default" w:ascii="Times New Roman" w:hAnsi="Times New Roman" w:eastAsia="SimSun" w:cs="Times New Roman"/>
+                <w:b w:val="0"/>
+                <w:bCs w:val="0"/>
+                <w:sz w:val="24"/>
+                <w:szCs w:val="24"/>
+              </w:rPr>
+            </w:pPr>
+            <w:r>
+              <w:rPr>
+                <w:rFonts w:hint="default" w:ascii="Times New Roman" w:hAnsi="Times New Roman" w:eastAsia="SimSun" w:cs="Times New Roman"/>
+                <w:b w:val="0"/>
+                <w:bCs w:val="0"/>
+                <w:sz w:val="24"/>
+                <w:szCs w:val="24"/>
+              </w:rPr>
+              <w:t>Need for a more comprehensive README that includes detailed usage and setup instructions.</w:t>
+            </w:r>
+          </w:p>
+        </w:tc>
+        <w:tc>
+          <w:tcPr>
+            <w:tcW w:w="3944" w:type="dxa"/>
+          </w:tcPr>
+          <w:p>
+            <w:pPr>
+              <w:jc w:val="both"/>
+              <w:rPr>
+                <w:rFonts w:hint="default" w:ascii="Times New Roman" w:hAnsi="Times New Roman" w:eastAsia="SimSun" w:cs="Times New Roman"/>
+                <w:b w:val="0"/>
+                <w:bCs w:val="0"/>
+                <w:sz w:val="24"/>
+                <w:szCs w:val="24"/>
+              </w:rPr>
+            </w:pPr>
+            <w:r>
+              <w:rPr>
+                <w:rFonts w:hint="default" w:ascii="Times New Roman" w:hAnsi="Times New Roman" w:eastAsia="SimSun" w:cs="Times New Roman"/>
+                <w:b w:val="0"/>
+                <w:bCs w:val="0"/>
+                <w:sz w:val="24"/>
+                <w:szCs w:val="24"/>
+              </w:rPr>
+              <w:t>Leader (Hieu) to provide specific content requirements</w:t>
+            </w:r>
+          </w:p>
+        </w:tc>
+        <w:tc>
+          <w:tcPr>
+            <w:tcW w:w="3842" w:type="dxa"/>
+          </w:tcPr>
+          <w:p>
+            <w:pPr>
+              <w:jc w:val="both"/>
+              <w:rPr>
+                <w:rFonts w:hint="default" w:ascii="Times New Roman" w:hAnsi="Times New Roman" w:eastAsia="SimSun" w:cs="Times New Roman"/>
+                <w:b w:val="0"/>
+                <w:bCs w:val="0"/>
+                <w:sz w:val="24"/>
+                <w:szCs w:val="24"/>
+              </w:rPr>
+            </w:pPr>
+            <w:r>
+              <w:rPr>
+                <w:rFonts w:hint="default" w:ascii="Times New Roman" w:hAnsi="Times New Roman" w:eastAsia="SimSun" w:cs="Times New Roman"/>
+                <w:b w:val="0"/>
+                <w:bCs w:val="0"/>
+                <w:sz w:val="24"/>
+                <w:szCs w:val="24"/>
+              </w:rPr>
+              <w:t>Hieu: Provide detailed requirements and update file by end of week.</w:t>
+            </w:r>
+          </w:p>
+        </w:tc>
+      </w:tr>
+    </w:tbl>
+    <w:p>
+      <w:pPr>
+        <w:jc w:val="both"/>
+        <w:rPr>
+          <w:rFonts w:hint="default" w:ascii="Times New Roman" w:hAnsi="Times New Roman" w:eastAsia="Times New Roman" w:cs="Times New Roman"/>
+          <w:b/>
+        </w:rPr>
+      </w:pPr>
+      <w:r>
+        <w:rPr>
+          <w:rFonts w:hint="default" w:ascii="Times New Roman" w:hAnsi="Times New Roman" w:eastAsia="Times New Roman" w:cs="Times New Roman"/>
+          <w:b/>
+        </w:rPr>
+        <w:t xml:space="preserve">Actions in brief: </w:t>
+      </w:r>
+    </w:p>
+    <w:p>
+      <w:pPr>
+        <w:ind w:firstLine="720" w:firstLineChars="0"/>
+        <w:jc w:val="both"/>
+        <w:rPr>
+          <w:rFonts w:hint="default" w:ascii="Times New Roman" w:hAnsi="Times New Roman" w:eastAsia="SimSun" w:cs="Times New Roman"/>
+          <w:b/>
+          <w:bCs/>
+          <w:sz w:val="24"/>
+          <w:szCs w:val="24"/>
+        </w:rPr>
+      </w:pPr>
+      <w:r>
+        <w:rPr>
+          <w:rFonts w:hint="default" w:ascii="Times New Roman" w:hAnsi="Times New Roman" w:eastAsia="Times New Roman" w:cs="Times New Roman"/>
+          <w:b/>
+          <w:bCs w:val="0"/>
+          <w:sz w:val="26"/>
+          <w:szCs w:val="26"/>
+          <w:lang w:val="en-US"/>
+        </w:rPr>
+        <w:t xml:space="preserve">+ </w:t>
+      </w:r>
+      <w:r>
+        <w:rPr>
+          <w:b/>
+          <w:bCs/>
+        </w:rPr>
+        <w:t>Model Implementation:</w:t>
+      </w:r>
+      <w:r>
+        <w:t xml:space="preserve"> Deploy Linear SVM for Spam detection and Random Forest for Malware detection; continue researching the best architecture for Newspaper classification.</w:t>
+      </w:r>
+      <w:bookmarkStart w:id="1" w:name="_GoBack"/>
+      <w:bookmarkEnd w:id="1"/>
+    </w:p>
+    <w:p>
+      <w:pPr>
+        <w:ind w:firstLine="720" w:firstLineChars="0"/>
+        <w:jc w:val="both"/>
+        <w:rPr>
+          <w:rFonts w:hint="default" w:ascii="Times New Roman" w:hAnsi="Times New Roman" w:eastAsia="SimSun" w:cs="Times New Roman"/>
+          <w:sz w:val="24"/>
+          <w:szCs w:val="24"/>
+        </w:rPr>
+      </w:pPr>
+      <w:r>
+        <w:rPr>
+          <w:rFonts w:hint="default" w:ascii="Times New Roman" w:hAnsi="Times New Roman" w:cs="Times New Roman"/>
+          <w:b/>
+          <w:bCs/>
+          <w:sz w:val="24"/>
+          <w:szCs w:val="24"/>
+          <w:lang w:val="en-US"/>
+        </w:rPr>
+        <w:t xml:space="preserve">+ </w:t>
+      </w:r>
+      <w:r>
+        <w:rPr>
+          <w:rFonts w:hint="default" w:ascii="Times New Roman" w:hAnsi="Times New Roman" w:eastAsia="SimSun" w:cs="Times New Roman"/>
+          <w:b/>
+          <w:bCs/>
+          <w:sz w:val="24"/>
+          <w:szCs w:val="24"/>
+        </w:rPr>
+        <w:t>Technical Selection:</w:t>
+      </w:r>
+      <w:r>
+        <w:rPr>
+          <w:rFonts w:hint="default" w:ascii="Times New Roman" w:hAnsi="Times New Roman" w:eastAsia="SimSun" w:cs="Times New Roman"/>
+          <w:sz w:val="24"/>
+          <w:szCs w:val="24"/>
+        </w:rPr>
+        <w:t xml:space="preserve"> The Leader will finalize the suggested models and datasets by the end of the break.</w:t>
+      </w:r>
+    </w:p>
+    <w:p>
+      <w:pPr>
+        <w:ind w:firstLine="720" w:firstLineChars="0"/>
+        <w:jc w:val="both"/>
+        <w:rPr>
+          <w:rFonts w:hint="default" w:ascii="Times New Roman" w:hAnsi="Times New Roman" w:eastAsia="SimSun" w:cs="Times New Roman"/>
+          <w:b w:val="0"/>
+          <w:bCs w:val="0"/>
+          <w:sz w:val="24"/>
+          <w:szCs w:val="24"/>
+        </w:rPr>
+      </w:pPr>
+      <w:r>
+        <w:rPr>
+          <w:rFonts w:hint="default" w:ascii="Times New Roman" w:hAnsi="Times New Roman" w:cs="Times New Roman"/>
+          <w:sz w:val="24"/>
+          <w:szCs w:val="24"/>
+          <w:lang w:val="en-US"/>
+        </w:rPr>
+        <w:t xml:space="preserve">+ </w:t>
+      </w:r>
+      <w:r>
+        <w:rPr>
+          <w:rFonts w:hint="default" w:ascii="Times New Roman" w:hAnsi="Times New Roman" w:eastAsia="SimSun" w:cs="Times New Roman"/>
+          <w:b/>
+          <w:bCs/>
+          <w:sz w:val="24"/>
+          <w:szCs w:val="24"/>
+        </w:rPr>
+        <w:t>Drafting Phase:</w:t>
+      </w:r>
+      <w:r>
+        <w:rPr>
+          <w:rFonts w:hint="default" w:ascii="Times New Roman" w:hAnsi="Times New Roman" w:eastAsia="SimSun" w:cs="Times New Roman"/>
+          <w:b w:val="0"/>
+          <w:bCs w:val="0"/>
+          <w:sz w:val="24"/>
+          <w:szCs w:val="24"/>
+        </w:rPr>
+        <w:t xml:space="preserve"> Immediately following the selection, the Leader will draft the Table of Contents, to be completed by Feb 6th, 21:00 p.m.</w:t>
+      </w:r>
+    </w:p>
+    <w:p>
+      <w:pPr>
+        <w:pStyle w:val="13"/>
+        <w:keepNext w:val="0"/>
+        <w:keepLines w:val="0"/>
+        <w:widowControl/>
+        <w:suppressLineNumbers w:val="0"/>
+      </w:pPr>
+      <w:r>
+        <w:rPr>
+          <w:rFonts w:ascii="Symbol" w:hAnsi="Symbol" w:eastAsia="Symbol" w:cs="Symbol"/>
+          <w:sz w:val="24"/>
+        </w:rPr>
+        <w:t>·</w:t>
+      </w:r>
+      <w:r>
+        <w:rPr>
+          <w:rFonts w:hint="eastAsia" w:ascii="SimSun" w:hAnsi="SimSun" w:eastAsia="SimSun" w:cs="SimSun"/>
+          <w:sz w:val="24"/>
+        </w:rPr>
+        <w:t xml:space="preserve">  </w:t>
+      </w:r>
+      <w:r>
+        <w:rPr>
+          <w:b/>
+          <w:bCs/>
+        </w:rPr>
+        <w:t>Model Implementation:</w:t>
+      </w:r>
+      <w:r>
+        <w:t xml:space="preserve"> Deploy Linear SVM for Spam detection and Random Forest for Malware detection; continue researching the best architecture for Newspaper classification.</w:t>
+      </w:r>
+    </w:p>
+    <w:p>
+      <w:pPr>
+        <w:pStyle w:val="13"/>
+        <w:keepNext w:val="0"/>
+        <w:keepLines w:val="0"/>
+        <w:widowControl/>
+        <w:suppressLineNumbers w:val="0"/>
+      </w:pPr>
+      <w:r>
+        <w:rPr>
+          <w:rFonts w:hint="default" w:ascii="Symbol" w:hAnsi="Symbol" w:eastAsia="Symbol" w:cs="Symbol"/>
+          <w:sz w:val="24"/>
+        </w:rPr>
+        <w:t>·</w:t>
+      </w:r>
+      <w:r>
+        <w:rPr>
+          <w:rFonts w:hint="eastAsia" w:ascii="SimSun" w:hAnsi="SimSun" w:eastAsia="SimSun" w:cs="SimSun"/>
+          <w:sz w:val="24"/>
+        </w:rPr>
+        <w:t xml:space="preserve">  </w:t>
+      </w:r>
+      <w:r>
+        <w:rPr>
+          <w:rFonts w:hint="default" w:ascii="Symbol" w:hAnsi="Symbol" w:eastAsia="Symbol" w:cs="Symbol"/>
+          <w:sz w:val="24"/>
+        </w:rPr>
+        <w:t>·</w:t>
+      </w:r>
+      <w:r>
+        <w:rPr>
+          <w:rFonts w:hint="eastAsia" w:ascii="SimSun" w:hAnsi="SimSun" w:eastAsia="SimSun" w:cs="SimSun"/>
+          <w:sz w:val="24"/>
+        </w:rPr>
+        <w:t xml:space="preserve">  </w:t>
+      </w:r>
+      <w:r>
+        <w:rPr>
+          <w:b/>
+          <w:bCs/>
+        </w:rPr>
+        <w:t>Dataset Scalability:</w:t>
+      </w:r>
+      <w:r>
+        <w:t xml:space="preserve"> All team members are required to investigate and propose technical solutions to handle large current datasets within a 1-day deadline.</w:t>
+      </w:r>
+    </w:p>
+    <w:p>
+      <w:pPr>
+        <w:pStyle w:val="13"/>
+        <w:keepNext w:val="0"/>
+        <w:keepLines w:val="0"/>
+        <w:widowControl/>
+        <w:suppressLineNumbers w:val="0"/>
+      </w:pPr>
+      <w:r>
+        <w:rPr>
+          <w:rFonts w:hint="default" w:ascii="Symbol" w:hAnsi="Symbol" w:eastAsia="Symbol" w:cs="Symbol"/>
+          <w:sz w:val="24"/>
+        </w:rPr>
+        <w:t>·</w:t>
+      </w:r>
+      <w:r>
+        <w:rPr>
+          <w:rFonts w:hint="eastAsia" w:ascii="SimSun" w:hAnsi="SimSun" w:eastAsia="SimSun" w:cs="SimSun"/>
+          <w:sz w:val="24"/>
+        </w:rPr>
+        <w:t xml:space="preserve">  </w:t>
+      </w:r>
+      <w:r>
+        <w:rPr>
+          <w:rFonts w:hint="default" w:ascii="Symbol" w:hAnsi="Symbol" w:eastAsia="Symbol" w:cs="Symbol"/>
+          <w:sz w:val="24"/>
+        </w:rPr>
+        <w:t>·</w:t>
+      </w:r>
+      <w:r>
+        <w:rPr>
+          <w:rFonts w:hint="eastAsia" w:ascii="SimSun" w:hAnsi="SimSun" w:eastAsia="SimSun" w:cs="SimSun"/>
+          <w:sz w:val="24"/>
+        </w:rPr>
+        <w:t xml:space="preserve">  </w:t>
+      </w:r>
+      <w:r>
+        <w:rPr>
+          <w:b/>
+          <w:bCs/>
+        </w:rPr>
+        <w:t>Reporting:</w:t>
+      </w:r>
+      <w:r>
+        <w:t xml:space="preserve"> Dang to take responsibility for drafting the content and Table of Contents for the second project report.</w:t>
+      </w:r>
+    </w:p>
+    <w:p>
+      <w:pPr>
+        <w:pStyle w:val="13"/>
+        <w:keepNext w:val="0"/>
+        <w:keepLines w:val="0"/>
+        <w:widowControl/>
+        <w:suppressLineNumbers w:val="0"/>
+      </w:pPr>
+      <w:r>
+        <w:rPr>
+          <w:rFonts w:hint="default" w:ascii="Symbol" w:hAnsi="Symbol" w:eastAsia="Symbol" w:cs="Symbol"/>
+          <w:sz w:val="24"/>
+        </w:rPr>
+        <w:t>·</w:t>
+      </w:r>
+      <w:r>
+        <w:rPr>
+          <w:rFonts w:hint="eastAsia" w:ascii="SimSun" w:hAnsi="SimSun" w:eastAsia="SimSun" w:cs="SimSun"/>
+          <w:sz w:val="24"/>
+        </w:rPr>
+        <w:t xml:space="preserve">  </w:t>
+      </w:r>
+      <w:r>
+        <w:rPr>
+          <w:rFonts w:hint="default" w:ascii="Symbol" w:hAnsi="Symbol" w:eastAsia="Symbol" w:cs="Symbol"/>
+          <w:sz w:val="24"/>
+        </w:rPr>
+        <w:t>·</w:t>
+      </w:r>
+      <w:r>
+        <w:rPr>
+          <w:rFonts w:hint="eastAsia" w:ascii="SimSun" w:hAnsi="SimSun" w:eastAsia="SimSun" w:cs="SimSun"/>
+          <w:sz w:val="24"/>
+        </w:rPr>
+        <w:t xml:space="preserve">  </w:t>
+      </w:r>
+      <w:r>
+        <w:rPr>
+          <w:b/>
+          <w:bCs/>
+        </w:rPr>
+        <w:t>Documentation:</w:t>
+      </w:r>
+      <w:r>
+        <w:t xml:space="preserve"> Hieu (Leader) to define specific requirements and update the README file to ensure clear project guidance.</w:t>
+      </w:r>
+    </w:p>
+    <w:p>
+      <w:pPr>
+        <w:pStyle w:val="13"/>
+        <w:keepNext w:val="0"/>
+        <w:keepLines w:val="0"/>
+        <w:widowControl/>
+        <w:suppressLineNumbers w:val="0"/>
+      </w:pPr>
+      <w:r>
+        <w:rPr>
+          <w:rFonts w:hint="default" w:ascii="Symbol" w:hAnsi="Symbol" w:eastAsia="Symbol" w:cs="Symbol"/>
+          <w:sz w:val="24"/>
+        </w:rPr>
+        <w:t>·</w:t>
+      </w:r>
+      <w:r>
+        <w:rPr>
+          <w:rFonts w:hint="eastAsia" w:ascii="SimSun" w:hAnsi="SimSun" w:eastAsia="SimSun" w:cs="SimSun"/>
+          <w:sz w:val="24"/>
+        </w:rPr>
+        <w:t xml:space="preserve">  </w:t>
+      </w:r>
+      <w:r>
+        <w:rPr>
+          <w:rFonts w:hint="default" w:ascii="Symbol" w:hAnsi="Symbol" w:eastAsia="Symbol" w:cs="Symbol"/>
+          <w:sz w:val="24"/>
+        </w:rPr>
+        <w:t>·</w:t>
+      </w:r>
+      <w:r>
+        <w:rPr>
+          <w:rFonts w:hint="eastAsia" w:ascii="SimSun" w:hAnsi="SimSun" w:eastAsia="SimSun" w:cs="SimSun"/>
+          <w:sz w:val="24"/>
+        </w:rPr>
+        <w:t xml:space="preserve">  </w:t>
+      </w:r>
+      <w:r>
+        <w:rPr>
+          <w:b/>
+          <w:bCs/>
+        </w:rPr>
+        <w:t>Administrative:</w:t>
+      </w:r>
+      <w:r>
+        <w:t xml:space="preserve"> Leo Anh to consistently take notes (MoM) for all subsequent meetings to ensure tracking of progress.</w:t>
+      </w:r>
+    </w:p>
+    <w:p>
+      <w:pPr>
+        <w:ind w:firstLine="720" w:firstLineChars="0"/>
+        <w:jc w:val="both"/>
+        <w:rPr>
+          <w:rFonts w:hint="default" w:ascii="Times New Roman" w:hAnsi="Times New Roman" w:eastAsia="SimSun" w:cs="Times New Roman"/>
+          <w:b w:val="0"/>
+          <w:bCs w:val="0"/>
+          <w:sz w:val="24"/>
+          <w:szCs w:val="24"/>
+          <w:lang w:val="en-US"/>
+        </w:rPr>
+      </w:pPr>
+      <w:r>
+        <w:rPr>
+          <w:rFonts w:hint="default" w:ascii="Symbol" w:hAnsi="Symbol" w:eastAsia="Symbol" w:cs="Symbol"/>
+          <w:sz w:val="24"/>
+        </w:rPr>
+        <w:t>·</w:t>
+      </w:r>
+      <w:r>
+        <w:rPr>
+          <w:rFonts w:hint="eastAsia" w:ascii="SimSun" w:hAnsi="SimSun" w:eastAsia="SimSun" w:cs="SimSun"/>
+          <w:sz w:val="24"/>
+        </w:rPr>
+        <w:t xml:space="preserve">  </w:t>
+      </w:r>
+    </w:p>
+    <w:p>
+      <w:pPr>
+        <w:jc w:val="both"/>
+        <w:rPr>
+          <w:rFonts w:hint="default" w:ascii="Times New Roman" w:hAnsi="Times New Roman" w:eastAsia="Times New Roman" w:cs="Times New Roman"/>
+          <w:lang w:val="en-US"/>
+        </w:rPr>
+      </w:pPr>
+    </w:p>
+    <w:p>
+      <w:pPr>
+        <w:jc w:val="both"/>
+        <w:rPr>
+          <w:rFonts w:hint="default" w:ascii="Times New Roman" w:hAnsi="Times New Roman" w:eastAsia="Times New Roman" w:cs="Times New Roman"/>
+          <w:lang w:val="en-US"/>
+        </w:rPr>
+      </w:pPr>
+      <w:r>
+        <w:rPr>
+          <w:rFonts w:hint="default" w:ascii="Times New Roman" w:hAnsi="Times New Roman" w:eastAsia="Times New Roman" w:cs="Times New Roman"/>
+          <w:b/>
+        </w:rPr>
+        <w:t xml:space="preserve">Meeting closed at: </w:t>
+      </w:r>
+      <w:r>
+        <w:rPr>
+          <w:rFonts w:hint="default" w:ascii="Times New Roman" w:hAnsi="Times New Roman" w:eastAsia="Times New Roman" w:cs="Times New Roman"/>
+          <w:b/>
+          <w:lang w:val="en-US"/>
+        </w:rPr>
+        <w:t>20</w:t>
+      </w:r>
+      <w:r>
+        <w:rPr>
+          <w:rFonts w:hint="default" w:ascii="Times New Roman" w:hAnsi="Times New Roman" w:eastAsia="Times New Roman" w:cs="Times New Roman"/>
+          <w:b w:val="0"/>
+          <w:bCs/>
+          <w:lang w:val="en-US"/>
+        </w:rPr>
+        <w:t>:45 p.m</w:t>
+      </w:r>
+    </w:p>
+    <w:p>
+      <w:pPr>
+        <w:jc w:val="both"/>
+        <w:rPr>
+          <w:rFonts w:hint="default" w:ascii="Times New Roman" w:hAnsi="Times New Roman" w:eastAsia="Times New Roman" w:cs="Times New Roman"/>
+          <w:b w:val="0"/>
+          <w:bCs/>
+          <w:lang w:val="en-US"/>
+        </w:rPr>
+      </w:pPr>
+      <w:r>
+        <w:rPr>
+          <w:rFonts w:hint="default" w:ascii="Times New Roman" w:hAnsi="Times New Roman" w:eastAsia="Times New Roman" w:cs="Times New Roman"/>
+          <w:b/>
+        </w:rPr>
+        <w:t>Next meeting time, date and location:</w:t>
+      </w:r>
+      <w:r>
+        <w:rPr>
+          <w:rFonts w:hint="default" w:ascii="Times New Roman" w:hAnsi="Times New Roman" w:eastAsia="Times New Roman" w:cs="Times New Roman"/>
+          <w:b w:val="0"/>
+          <w:bCs/>
+        </w:rPr>
+        <w:t xml:space="preserve"> </w:t>
+      </w:r>
+    </w:p>
+    <w:p>
+      <w:pPr>
+        <w:jc w:val="both"/>
+        <w:rPr>
+          <w:rFonts w:hint="default" w:ascii="Times New Roman" w:hAnsi="Times New Roman" w:eastAsia="Times New Roman" w:cs="Times New Roman"/>
+          <w:b w:val="0"/>
+          <w:bCs/>
+          <w:lang w:val="en-US"/>
+        </w:rPr>
+      </w:pPr>
     </w:p>
     <w:sectPr>
       <w:pgSz w:w="16840" w:h="11900" w:orient="landscape"/>

</xml_diff>

<commit_message>
Add file Loader.py an Brain.py
</commit_message>
<xml_diff>
--- a/Document/Meeting Minutes v2.docx
+++ b/Document/Meeting Minutes v2.docx
@@ -6407,6 +6407,8 @@
         </w:rPr>
         <w:t xml:space="preserve"> Mar, 2026</w:t>
       </w:r>
+      <w:bookmarkStart w:id="1" w:name="_GoBack"/>
+      <w:bookmarkEnd w:id="1"/>
     </w:p>
     <w:p>
       <w:pPr>
@@ -7758,16 +7760,18 @@
       </w:r>
       <w:r>
         <w:rPr>
+          <w:rFonts w:hint="default" w:ascii="Times New Roman" w:hAnsi="Times New Roman" w:cs="Times New Roman"/>
           <w:b/>
           <w:bCs/>
         </w:rPr>
         <w:t>Model Implementation:</w:t>
       </w:r>
       <w:r>
+        <w:rPr>
+          <w:rFonts w:hint="default" w:ascii="Times New Roman" w:hAnsi="Times New Roman" w:cs="Times New Roman"/>
+        </w:rPr>
         <w:t xml:space="preserve"> Deploy Linear SVM for Spam detection and Random Forest for Malware detection; continue researching the best architecture for Newspaper classification.</w:t>
       </w:r>
-      <w:bookmarkStart w:id="1" w:name="_GoBack"/>
-      <w:bookmarkEnd w:id="1"/>
     </w:p>
     <w:p>
       <w:pPr>
@@ -7792,21 +7796,17 @@
       </w:r>
       <w:r>
         <w:rPr>
-          <w:rFonts w:hint="default" w:ascii="Times New Roman" w:hAnsi="Times New Roman" w:eastAsia="SimSun" w:cs="Times New Roman"/>
+          <w:rFonts w:hint="default" w:ascii="Times New Roman" w:hAnsi="Times New Roman" w:cs="Times New Roman"/>
           <w:b/>
           <w:bCs/>
-          <w:sz w:val="24"/>
-          <w:szCs w:val="24"/>
-        </w:rPr>
-        <w:t>Technical Selection:</w:t>
-      </w:r>
-      <w:r>
-        <w:rPr>
-          <w:rFonts w:hint="default" w:ascii="Times New Roman" w:hAnsi="Times New Roman" w:eastAsia="SimSun" w:cs="Times New Roman"/>
-          <w:sz w:val="24"/>
-          <w:szCs w:val="24"/>
-        </w:rPr>
-        <w:t xml:space="preserve"> The Leader will finalize the suggested models and datasets by the end of the break.</w:t>
+        </w:rPr>
+        <w:t>Dataset Scalability:</w:t>
+      </w:r>
+      <w:r>
+        <w:rPr>
+          <w:rFonts w:hint="default" w:ascii="Times New Roman" w:hAnsi="Times New Roman" w:cs="Times New Roman"/>
+        </w:rPr>
+        <w:t xml:space="preserve"> All team members are required to investigate and propose technical solutions to handle large current datasets within a 1-day deadline</w:t>
       </w:r>
     </w:p>
     <w:p>
@@ -7814,11 +7814,8 @@
         <w:ind w:firstLine="720" w:firstLineChars="0"/>
         <w:jc w:val="both"/>
         <w:rPr>
-          <w:rFonts w:hint="default" w:ascii="Times New Roman" w:hAnsi="Times New Roman" w:eastAsia="SimSun" w:cs="Times New Roman"/>
-          <w:b w:val="0"/>
-          <w:bCs w:val="0"/>
-          <w:sz w:val="24"/>
-          <w:szCs w:val="24"/>
+          <w:rFonts w:hint="default" w:ascii="Times New Roman" w:hAnsi="Times New Roman" w:cs="Times New Roman"/>
+          <w:lang w:val="en-US"/>
         </w:rPr>
       </w:pPr>
       <w:r>
@@ -7832,23 +7829,24 @@
       </w:r>
       <w:r>
         <w:rPr>
-          <w:rFonts w:hint="default" w:ascii="Times New Roman" w:hAnsi="Times New Roman" w:eastAsia="SimSun" w:cs="Times New Roman"/>
+          <w:rFonts w:hint="default" w:ascii="Times New Roman" w:hAnsi="Times New Roman" w:cs="Times New Roman"/>
           <w:b/>
           <w:bCs/>
-          <w:sz w:val="24"/>
-          <w:szCs w:val="24"/>
-        </w:rPr>
-        <w:t>Drafting Phase:</w:t>
-      </w:r>
-      <w:r>
-        <w:rPr>
-          <w:rFonts w:hint="default" w:ascii="Times New Roman" w:hAnsi="Times New Roman" w:eastAsia="SimSun" w:cs="Times New Roman"/>
-          <w:b w:val="0"/>
-          <w:bCs w:val="0"/>
-          <w:sz w:val="24"/>
-          <w:szCs w:val="24"/>
-        </w:rPr>
-        <w:t xml:space="preserve"> Immediately following the selection, the Leader will draft the Table of Contents, to be completed by Feb 6th, 21:00 p.m.</w:t>
+        </w:rPr>
+        <w:t>Reporting:</w:t>
+      </w:r>
+      <w:r>
+        <w:rPr>
+          <w:rFonts w:hint="default" w:ascii="Times New Roman" w:hAnsi="Times New Roman" w:cs="Times New Roman"/>
+        </w:rPr>
+        <w:t xml:space="preserve"> Dang to take responsibility for drafting the content and Table of Contents for the second project repor</w:t>
+      </w:r>
+      <w:r>
+        <w:rPr>
+          <w:rFonts w:hint="default" w:ascii="Times New Roman" w:hAnsi="Times New Roman" w:cs="Times New Roman"/>
+          <w:lang w:val="en-US"/>
+        </w:rPr>
+        <w:t>t.</w:t>
       </w:r>
     </w:p>
     <w:p>
@@ -7858,30 +7856,31 @@
         <w:keepLines w:val="0"/>
         <w:widowControl/>
         <w:suppressLineNumbers w:val="0"/>
-      </w:pPr>
-      <w:r>
-        <w:rPr>
-          <w:rFonts w:ascii="Symbol" w:hAnsi="Symbol" w:eastAsia="Symbol" w:cs="Symbol"/>
-          <w:sz w:val="24"/>
-        </w:rPr>
-        <w:t>·</w:t>
-      </w:r>
-      <w:r>
-        <w:rPr>
-          <w:rFonts w:hint="eastAsia" w:ascii="SimSun" w:hAnsi="SimSun" w:eastAsia="SimSun" w:cs="SimSun"/>
-          <w:sz w:val="24"/>
-        </w:rPr>
-        <w:t xml:space="preserve">  </w:t>
-      </w:r>
-      <w:r>
-        <w:rPr>
+        <w:ind w:left="720" w:leftChars="300" w:firstLine="0" w:firstLineChars="0"/>
+        <w:rPr>
+          <w:rFonts w:hint="default" w:ascii="Times New Roman" w:hAnsi="Times New Roman" w:cs="Times New Roman"/>
+        </w:rPr>
+      </w:pPr>
+      <w:r>
+        <w:rPr>
+          <w:rFonts w:hint="default" w:ascii="Times New Roman" w:hAnsi="Times New Roman" w:cs="Times New Roman"/>
+          <w:lang w:val="en-US"/>
+        </w:rPr>
+        <w:t xml:space="preserve">+ </w:t>
+      </w:r>
+      <w:r>
+        <w:rPr>
+          <w:rFonts w:hint="default" w:ascii="Times New Roman" w:hAnsi="Times New Roman" w:cs="Times New Roman"/>
           <w:b/>
           <w:bCs/>
         </w:rPr>
-        <w:t>Model Implementation:</w:t>
-      </w:r>
-      <w:r>
-        <w:t xml:space="preserve"> Deploy Linear SVM for Spam detection and Random Forest for Malware detection; continue researching the best architecture for Newspaper classification.</w:t>
+        <w:t>Documentation:</w:t>
+      </w:r>
+      <w:r>
+        <w:rPr>
+          <w:rFonts w:hint="default" w:ascii="Times New Roman" w:hAnsi="Times New Roman" w:cs="Times New Roman"/>
+        </w:rPr>
+        <w:t xml:space="preserve"> Hieu (Leader) to define specific requirements and update the README file to ensure clear project guidance.</w:t>
       </w:r>
     </w:p>
     <w:p>
@@ -7891,213 +7890,32 @@
         <w:keepLines w:val="0"/>
         <w:widowControl/>
         <w:suppressLineNumbers w:val="0"/>
-      </w:pPr>
-      <w:r>
-        <w:rPr>
-          <w:rFonts w:hint="default" w:ascii="Symbol" w:hAnsi="Symbol" w:eastAsia="Symbol" w:cs="Symbol"/>
-          <w:sz w:val="24"/>
-        </w:rPr>
-        <w:t>·</w:t>
-      </w:r>
-      <w:r>
-        <w:rPr>
-          <w:rFonts w:hint="eastAsia" w:ascii="SimSun" w:hAnsi="SimSun" w:eastAsia="SimSun" w:cs="SimSun"/>
-          <w:sz w:val="24"/>
-        </w:rPr>
-        <w:t xml:space="preserve">  </w:t>
-      </w:r>
-      <w:r>
-        <w:rPr>
-          <w:rFonts w:hint="default" w:ascii="Symbol" w:hAnsi="Symbol" w:eastAsia="Symbol" w:cs="Symbol"/>
-          <w:sz w:val="24"/>
-        </w:rPr>
-        <w:t>·</w:t>
-      </w:r>
-      <w:r>
-        <w:rPr>
-          <w:rFonts w:hint="eastAsia" w:ascii="SimSun" w:hAnsi="SimSun" w:eastAsia="SimSun" w:cs="SimSun"/>
-          <w:sz w:val="24"/>
-        </w:rPr>
-        <w:t xml:space="preserve">  </w:t>
-      </w:r>
-      <w:r>
-        <w:rPr>
+        <w:ind w:left="720" w:leftChars="300" w:firstLine="0" w:firstLineChars="0"/>
+        <w:rPr>
+          <w:rFonts w:hint="default" w:ascii="Times New Roman" w:hAnsi="Times New Roman" w:cs="Times New Roman"/>
+          <w:lang w:val="en-US"/>
+        </w:rPr>
+      </w:pPr>
+      <w:r>
+        <w:rPr>
+          <w:rFonts w:hint="default" w:ascii="Times New Roman" w:hAnsi="Times New Roman" w:cs="Times New Roman"/>
+          <w:lang w:val="en-US"/>
+        </w:rPr>
+        <w:t xml:space="preserve">+ </w:t>
+      </w:r>
+      <w:r>
+        <w:rPr>
+          <w:rFonts w:hint="default" w:ascii="Times New Roman" w:hAnsi="Times New Roman" w:cs="Times New Roman"/>
           <w:b/>
           <w:bCs/>
         </w:rPr>
-        <w:t>Dataset Scalability:</w:t>
-      </w:r>
-      <w:r>
-        <w:t xml:space="preserve"> All team members are required to investigate and propose technical solutions to handle large current datasets within a 1-day deadline.</w:t>
-      </w:r>
-    </w:p>
-    <w:p>
-      <w:pPr>
-        <w:pStyle w:val="13"/>
-        <w:keepNext w:val="0"/>
-        <w:keepLines w:val="0"/>
-        <w:widowControl/>
-        <w:suppressLineNumbers w:val="0"/>
-      </w:pPr>
-      <w:r>
-        <w:rPr>
-          <w:rFonts w:hint="default" w:ascii="Symbol" w:hAnsi="Symbol" w:eastAsia="Symbol" w:cs="Symbol"/>
-          <w:sz w:val="24"/>
-        </w:rPr>
-        <w:t>·</w:t>
-      </w:r>
-      <w:r>
-        <w:rPr>
-          <w:rFonts w:hint="eastAsia" w:ascii="SimSun" w:hAnsi="SimSun" w:eastAsia="SimSun" w:cs="SimSun"/>
-          <w:sz w:val="24"/>
-        </w:rPr>
-        <w:t xml:space="preserve">  </w:t>
-      </w:r>
-      <w:r>
-        <w:rPr>
-          <w:rFonts w:hint="default" w:ascii="Symbol" w:hAnsi="Symbol" w:eastAsia="Symbol" w:cs="Symbol"/>
-          <w:sz w:val="24"/>
-        </w:rPr>
-        <w:t>·</w:t>
-      </w:r>
-      <w:r>
-        <w:rPr>
-          <w:rFonts w:hint="eastAsia" w:ascii="SimSun" w:hAnsi="SimSun" w:eastAsia="SimSun" w:cs="SimSun"/>
-          <w:sz w:val="24"/>
-        </w:rPr>
-        <w:t xml:space="preserve">  </w:t>
-      </w:r>
-      <w:r>
-        <w:rPr>
-          <w:b/>
-          <w:bCs/>
-        </w:rPr>
-        <w:t>Reporting:</w:t>
-      </w:r>
-      <w:r>
-        <w:t xml:space="preserve"> Dang to take responsibility for drafting the content and Table of Contents for the second project report.</w:t>
-      </w:r>
-    </w:p>
-    <w:p>
-      <w:pPr>
-        <w:pStyle w:val="13"/>
-        <w:keepNext w:val="0"/>
-        <w:keepLines w:val="0"/>
-        <w:widowControl/>
-        <w:suppressLineNumbers w:val="0"/>
-      </w:pPr>
-      <w:r>
-        <w:rPr>
-          <w:rFonts w:hint="default" w:ascii="Symbol" w:hAnsi="Symbol" w:eastAsia="Symbol" w:cs="Symbol"/>
-          <w:sz w:val="24"/>
-        </w:rPr>
-        <w:t>·</w:t>
-      </w:r>
-      <w:r>
-        <w:rPr>
-          <w:rFonts w:hint="eastAsia" w:ascii="SimSun" w:hAnsi="SimSun" w:eastAsia="SimSun" w:cs="SimSun"/>
-          <w:sz w:val="24"/>
-        </w:rPr>
-        <w:t xml:space="preserve">  </w:t>
-      </w:r>
-      <w:r>
-        <w:rPr>
-          <w:rFonts w:hint="default" w:ascii="Symbol" w:hAnsi="Symbol" w:eastAsia="Symbol" w:cs="Symbol"/>
-          <w:sz w:val="24"/>
-        </w:rPr>
-        <w:t>·</w:t>
-      </w:r>
-      <w:r>
-        <w:rPr>
-          <w:rFonts w:hint="eastAsia" w:ascii="SimSun" w:hAnsi="SimSun" w:eastAsia="SimSun" w:cs="SimSun"/>
-          <w:sz w:val="24"/>
-        </w:rPr>
-        <w:t xml:space="preserve">  </w:t>
-      </w:r>
-      <w:r>
-        <w:rPr>
-          <w:b/>
-          <w:bCs/>
-        </w:rPr>
-        <w:t>Documentation:</w:t>
-      </w:r>
-      <w:r>
-        <w:t xml:space="preserve"> Hieu (Leader) to define specific requirements and update the README file to ensure clear project guidance.</w:t>
-      </w:r>
-    </w:p>
-    <w:p>
-      <w:pPr>
-        <w:pStyle w:val="13"/>
-        <w:keepNext w:val="0"/>
-        <w:keepLines w:val="0"/>
-        <w:widowControl/>
-        <w:suppressLineNumbers w:val="0"/>
-      </w:pPr>
-      <w:r>
-        <w:rPr>
-          <w:rFonts w:hint="default" w:ascii="Symbol" w:hAnsi="Symbol" w:eastAsia="Symbol" w:cs="Symbol"/>
-          <w:sz w:val="24"/>
-        </w:rPr>
-        <w:t>·</w:t>
-      </w:r>
-      <w:r>
-        <w:rPr>
-          <w:rFonts w:hint="eastAsia" w:ascii="SimSun" w:hAnsi="SimSun" w:eastAsia="SimSun" w:cs="SimSun"/>
-          <w:sz w:val="24"/>
-        </w:rPr>
-        <w:t xml:space="preserve">  </w:t>
-      </w:r>
-      <w:r>
-        <w:rPr>
-          <w:rFonts w:hint="default" w:ascii="Symbol" w:hAnsi="Symbol" w:eastAsia="Symbol" w:cs="Symbol"/>
-          <w:sz w:val="24"/>
-        </w:rPr>
-        <w:t>·</w:t>
-      </w:r>
-      <w:r>
-        <w:rPr>
-          <w:rFonts w:hint="eastAsia" w:ascii="SimSun" w:hAnsi="SimSun" w:eastAsia="SimSun" w:cs="SimSun"/>
-          <w:sz w:val="24"/>
-        </w:rPr>
-        <w:t xml:space="preserve">  </w:t>
-      </w:r>
-      <w:r>
-        <w:rPr>
-          <w:b/>
-          <w:bCs/>
-        </w:rPr>
         <w:t>Administrative:</w:t>
       </w:r>
       <w:r>
+        <w:rPr>
+          <w:rFonts w:hint="default" w:ascii="Times New Roman" w:hAnsi="Times New Roman" w:cs="Times New Roman"/>
+        </w:rPr>
         <w:t xml:space="preserve"> Leo Anh to consistently take notes (MoM) for all subsequent meetings to ensure tracking of progress.</w:t>
-      </w:r>
-    </w:p>
-    <w:p>
-      <w:pPr>
-        <w:ind w:firstLine="720" w:firstLineChars="0"/>
-        <w:jc w:val="both"/>
-        <w:rPr>
-          <w:rFonts w:hint="default" w:ascii="Times New Roman" w:hAnsi="Times New Roman" w:eastAsia="SimSun" w:cs="Times New Roman"/>
-          <w:b w:val="0"/>
-          <w:bCs w:val="0"/>
-          <w:sz w:val="24"/>
-          <w:szCs w:val="24"/>
-          <w:lang w:val="en-US"/>
-        </w:rPr>
-      </w:pPr>
-      <w:r>
-        <w:rPr>
-          <w:rFonts w:hint="default" w:ascii="Symbol" w:hAnsi="Symbol" w:eastAsia="Symbol" w:cs="Symbol"/>
-          <w:sz w:val="24"/>
-        </w:rPr>
-        <w:t>·</w:t>
-      </w:r>
-      <w:r>
-        <w:rPr>
-          <w:rFonts w:hint="eastAsia" w:ascii="SimSun" w:hAnsi="SimSun" w:eastAsia="SimSun" w:cs="SimSun"/>
-          <w:sz w:val="24"/>
-        </w:rPr>
-        <w:t xml:space="preserve">  </w:t>
       </w:r>
     </w:p>
     <w:p>

</xml_diff>